<commit_message>
Update LLM Evals doc: add Previous Pattern column + plain English
RAG Pattern Experiments table now has 7 columns including Previous
Pattern (shows which baseline each pattern builds from) and expanded
plain-English explanations in What's Different column.

Co-Authored-By: Claude Sonnet 4.6 <noreply@anthropic.com>
</commit_message>
<xml_diff>
--- a/docs/LLM_Evals_Trace_and_Error_Analysis_v2.docx
+++ b/docs/LLM_Evals_Trace_and_Error_Analysis_v2.docx
@@ -18289,11 +18289,12 @@
         </w:tblBorders>
       </w:tblPr>
       <w:tblGrid>
+        <w:gridCol w:w="700"/>
+        <w:gridCol w:w="1600"/>
+        <w:gridCol w:w="1700"/>
         <w:gridCol w:w="1000"/>
-        <w:gridCol w:w="2200"/>
-        <w:gridCol w:w="2000"/>
-        <w:gridCol w:w="2000"/>
-        <w:gridCol w:w="2880"/>
+        <w:gridCol w:w="2440"/>
+        <w:gridCol w:w="2640"/>
       </w:tblGrid>
       <w:tr>
         <w:trPr>
@@ -18301,7 +18302,7 @@
         </w:trPr>
         <w:tc>
           <w:tcPr>
-            <w:tcW w:type="dxa" w:w="1000"/>
+            <w:tcW w:type="dxa" w:w="600"/>
             <w:tcBorders>
               <w:top w:val="single" w:color="BDD7EE" w:sz="1"/>
               <w:left w:val="single" w:color="BDD7EE" w:sz="1"/>
@@ -18336,7 +18337,7 @@
         </w:tc>
         <w:tc>
           <w:tcPr>
-            <w:tcW w:type="dxa" w:w="2200"/>
+            <w:tcW w:type="dxa" w:w="1400"/>
             <w:tcBorders>
               <w:top w:val="single" w:color="BDD7EE" w:sz="1"/>
               <w:left w:val="single" w:color="BDD7EE" w:sz="1"/>
@@ -18365,13 +18366,13 @@
                 <w:sz w:val="18"/>
                 <w:szCs w:val="18"/>
               </w:rPr>
-              <w:t xml:space="preserve">Pattern</w:t>
-            </w:r>
-          </w:p>
-        </w:tc>
-        <w:tc>
-          <w:tcPr>
-            <w:tcW w:type="dxa" w:w="2000"/>
+              <w:t xml:space="preserve">Previous Pattern</w:t>
+            </w:r>
+          </w:p>
+        </w:tc>
+        <w:tc>
+          <w:tcPr>
+            <w:tcW w:type="dxa" w:w="1500"/>
             <w:tcBorders>
               <w:top w:val="single" w:color="BDD7EE" w:sz="1"/>
               <w:left w:val="single" w:color="BDD7EE" w:sz="1"/>
@@ -18400,13 +18401,13 @@
                 <w:sz w:val="18"/>
                 <w:szCs w:val="18"/>
               </w:rPr>
-              <w:t xml:space="preserve">Script</w:t>
-            </w:r>
-          </w:p>
-        </w:tc>
-        <w:tc>
-          <w:tcPr>
-            <w:tcW w:type="dxa" w:w="2000"/>
+              <w:t xml:space="preserve">Current Pattern</w:t>
+            </w:r>
+          </w:p>
+        </w:tc>
+        <w:tc>
+          <w:tcPr>
+            <w:tcW w:type="dxa" w:w="1400"/>
             <w:tcBorders>
               <w:top w:val="single" w:color="BDD7EE" w:sz="1"/>
               <w:left w:val="single" w:color="BDD7EE" w:sz="1"/>
@@ -18435,13 +18436,13 @@
                 <w:sz w:val="18"/>
                 <w:szCs w:val="18"/>
               </w:rPr>
-              <w:t xml:space="preserve">Accuracy</w:t>
-            </w:r>
-          </w:p>
-        </w:tc>
-        <w:tc>
-          <w:tcPr>
-            <w:tcW w:type="dxa" w:w="2880"/>
+              <w:t xml:space="preserve">Script</w:t>
+            </w:r>
+          </w:p>
+        </w:tc>
+        <w:tc>
+          <w:tcPr>
+            <w:tcW w:type="dxa" w:w="800"/>
             <w:tcBorders>
               <w:top w:val="single" w:color="BDD7EE" w:sz="1"/>
               <w:left w:val="single" w:color="BDD7EE" w:sz="1"/>
@@ -18470,6 +18471,76 @@
                 <w:sz w:val="18"/>
                 <w:szCs w:val="18"/>
               </w:rPr>
+              <w:t xml:space="preserve">Accuracy</w:t>
+            </w:r>
+          </w:p>
+        </w:tc>
+        <w:tc>
+          <w:tcPr>
+            <w:tcW w:type="dxa" w:w="2200"/>
+            <w:tcBorders>
+              <w:top w:val="single" w:color="BDD7EE" w:sz="1"/>
+              <w:left w:val="single" w:color="BDD7EE" w:sz="1"/>
+              <w:bottom w:val="single" w:color="BDD7EE" w:sz="1"/>
+              <w:right w:val="single" w:color="BDD7EE" w:sz="1"/>
+            </w:tcBorders>
+            <w:shd w:fill="1F4E79" w:val="clear"/>
+            <w:tcMar>
+              <w:top w:type="dxa" w:w="80"/>
+              <w:left w:type="dxa" w:w="150"/>
+              <w:bottom w:type="dxa" w:w="80"/>
+              <w:right w:type="dxa" w:w="150"/>
+            </w:tcMar>
+            <w:vAlign w:val="center"/>
+          </w:tcPr>
+          <w:p>
+            <w:pPr>
+              <w:jc w:val="left"/>
+            </w:pPr>
+            <w:r>
+              <w:rPr>
+                <w:rFonts w:ascii="Arial" w:cs="Arial" w:eastAsia="Arial" w:hAnsi="Arial"/>
+                <w:b/>
+                <w:bCs/>
+                <w:color w:val="FFFFFF"/>
+                <w:sz w:val="18"/>
+                <w:szCs w:val="18"/>
+              </w:rPr>
+              <w:t xml:space="preserve">What's Different (Plain English)</w:t>
+            </w:r>
+          </w:p>
+        </w:tc>
+        <w:tc>
+          <w:tcPr>
+            <w:tcW w:type="dxa" w:w="2180"/>
+            <w:tcBorders>
+              <w:top w:val="single" w:color="BDD7EE" w:sz="1"/>
+              <w:left w:val="single" w:color="BDD7EE" w:sz="1"/>
+              <w:bottom w:val="single" w:color="BDD7EE" w:sz="1"/>
+              <w:right w:val="single" w:color="BDD7EE" w:sz="1"/>
+            </w:tcBorders>
+            <w:shd w:fill="1F4E79" w:val="clear"/>
+            <w:tcMar>
+              <w:top w:type="dxa" w:w="80"/>
+              <w:left w:type="dxa" w:w="150"/>
+              <w:bottom w:type="dxa" w:w="80"/>
+              <w:right w:type="dxa" w:w="150"/>
+            </w:tcMar>
+            <w:vAlign w:val="center"/>
+          </w:tcPr>
+          <w:p>
+            <w:pPr>
+              <w:jc w:val="left"/>
+            </w:pPr>
+            <w:r>
+              <w:rPr>
+                <w:rFonts w:ascii="Arial" w:cs="Arial" w:eastAsia="Arial" w:hAnsi="Arial"/>
+                <w:b/>
+                <w:bCs/>
+                <w:color w:val="FFFFFF"/>
+                <w:sz w:val="18"/>
+                <w:szCs w:val="18"/>
+              </w:rPr>
               <w:t xml:space="preserve">Key Lesson</w:t>
             </w:r>
           </w:p>
@@ -18478,36 +18549,176 @@
       <w:tr>
         <w:tc>
           <w:tcPr>
-            <w:tcW w:type="dxa" w:w="1000"/>
-            <w:tcBorders>
-              <w:top w:val="single" w:color="BDD7EE" w:sz="1"/>
-              <w:left w:val="single" w:color="BDD7EE" w:sz="1"/>
-              <w:bottom w:val="single" w:color="BDD7EE" w:sz="1"/>
-              <w:right w:val="single" w:color="BDD7EE" w:sz="1"/>
-            </w:tcBorders>
-            <w:shd w:fill="FFFFFF" w:val="clear"/>
-            <w:tcMar>
-              <w:top w:type="dxa" w:w="80"/>
-              <w:left w:type="dxa" w:w="150"/>
-              <w:bottom w:type="dxa" w:w="80"/>
-              <w:right w:type="dxa" w:w="150"/>
-            </w:tcMar>
-            <w:vAlign w:val="center"/>
-          </w:tcPr>
-          <w:p>
-            <w:pPr>
-              <w:jc w:val="left"/>
-            </w:pPr>
-            <w:r>
-              <w:rPr>
-                <w:rFonts w:ascii="Arial" w:cs="Arial" w:eastAsia="Arial" w:hAnsi="Arial"/>
-                <w:b w:val="false"/>
-                <w:bCs w:val="false"/>
-                <w:color w:val="000000"/>
-                <w:sz w:val="18"/>
-                <w:szCs w:val="18"/>
-              </w:rPr>
-              <w:t xml:space="preserve">Baseline</w:t>
+            <w:tcW w:type="dxa" w:w="600"/>
+            <w:tcBorders>
+              <w:top w:val="single" w:color="BDD7EE" w:sz="1"/>
+              <w:left w:val="single" w:color="BDD7EE" w:sz="1"/>
+              <w:bottom w:val="single" w:color="BDD7EE" w:sz="1"/>
+              <w:right w:val="single" w:color="BDD7EE" w:sz="1"/>
+            </w:tcBorders>
+            <w:shd w:fill="FFFFFF" w:val="clear"/>
+            <w:tcMar>
+              <w:top w:type="dxa" w:w="80"/>
+              <w:left w:type="dxa" w:w="150"/>
+              <w:bottom w:type="dxa" w:w="80"/>
+              <w:right w:type="dxa" w:w="150"/>
+            </w:tcMar>
+            <w:vAlign w:val="center"/>
+          </w:tcPr>
+          <w:p>
+            <w:pPr>
+              <w:jc w:val="left"/>
+            </w:pPr>
+            <w:r>
+              <w:rPr>
+                <w:rFonts w:ascii="Arial" w:cs="Arial" w:eastAsia="Arial" w:hAnsi="Arial"/>
+                <w:b w:val="false"/>
+                <w:bCs w:val="false"/>
+                <w:color w:val="000000"/>
+                <w:sz w:val="18"/>
+                <w:szCs w:val="18"/>
+              </w:rPr>
+              <w:t xml:space="preserve">Base</w:t>
+            </w:r>
+          </w:p>
+        </w:tc>
+        <w:tc>
+          <w:tcPr>
+            <w:tcW w:type="dxa" w:w="1400"/>
+            <w:tcBorders>
+              <w:top w:val="single" w:color="BDD7EE" w:sz="1"/>
+              <w:left w:val="single" w:color="BDD7EE" w:sz="1"/>
+              <w:bottom w:val="single" w:color="BDD7EE" w:sz="1"/>
+              <w:right w:val="single" w:color="BDD7EE" w:sz="1"/>
+            </w:tcBorders>
+            <w:shd w:fill="FFFFFF" w:val="clear"/>
+            <w:tcMar>
+              <w:top w:type="dxa" w:w="80"/>
+              <w:left w:type="dxa" w:w="150"/>
+              <w:bottom w:type="dxa" w:w="80"/>
+              <w:right w:type="dxa" w:w="150"/>
+            </w:tcMar>
+            <w:vAlign w:val="center"/>
+          </w:tcPr>
+          <w:p>
+            <w:pPr>
+              <w:jc w:val="left"/>
+            </w:pPr>
+            <w:r>
+              <w:rPr>
+                <w:rFonts w:ascii="Arial" w:cs="Arial" w:eastAsia="Arial" w:hAnsi="Arial"/>
+                <w:b w:val="false"/>
+                <w:bCs w:val="false"/>
+                <w:color w:val="000000"/>
+                <w:sz w:val="18"/>
+                <w:szCs w:val="18"/>
+              </w:rPr>
+              <w:t xml:space="preserve">—</w:t>
+            </w:r>
+          </w:p>
+        </w:tc>
+        <w:tc>
+          <w:tcPr>
+            <w:tcW w:type="dxa" w:w="1500"/>
+            <w:tcBorders>
+              <w:top w:val="single" w:color="BDD7EE" w:sz="1"/>
+              <w:left w:val="single" w:color="BDD7EE" w:sz="1"/>
+              <w:bottom w:val="single" w:color="BDD7EE" w:sz="1"/>
+              <w:right w:val="single" w:color="BDD7EE" w:sz="1"/>
+            </w:tcBorders>
+            <w:shd w:fill="FFFFFF" w:val="clear"/>
+            <w:tcMar>
+              <w:top w:type="dxa" w:w="80"/>
+              <w:left w:type="dxa" w:w="150"/>
+              <w:bottom w:type="dxa" w:w="80"/>
+              <w:right w:type="dxa" w:w="150"/>
+            </w:tcMar>
+            <w:vAlign w:val="center"/>
+          </w:tcPr>
+          <w:p>
+            <w:pPr>
+              <w:jc w:val="left"/>
+            </w:pPr>
+            <w:r>
+              <w:rPr>
+                <w:rFonts w:ascii="Arial" w:cs="Arial" w:eastAsia="Arial" w:hAnsi="Arial"/>
+                <w:b w:val="false"/>
+                <w:bCs w:val="false"/>
+                <w:color w:val="000000"/>
+                <w:sz w:val="18"/>
+                <w:szCs w:val="18"/>
+              </w:rPr>
+              <w:t xml:space="preserve">MiniLM-L6-v2 (384d)</w:t>
+            </w:r>
+          </w:p>
+        </w:tc>
+        <w:tc>
+          <w:tcPr>
+            <w:tcW w:type="dxa" w:w="1400"/>
+            <w:tcBorders>
+              <w:top w:val="single" w:color="BDD7EE" w:sz="1"/>
+              <w:left w:val="single" w:color="BDD7EE" w:sz="1"/>
+              <w:bottom w:val="single" w:color="BDD7EE" w:sz="1"/>
+              <w:right w:val="single" w:color="BDD7EE" w:sz="1"/>
+            </w:tcBorders>
+            <w:shd w:fill="FFFFFF" w:val="clear"/>
+            <w:tcMar>
+              <w:top w:type="dxa" w:w="80"/>
+              <w:left w:type="dxa" w:w="150"/>
+              <w:bottom w:type="dxa" w:w="80"/>
+              <w:right w:type="dxa" w:w="150"/>
+            </w:tcMar>
+            <w:vAlign w:val="center"/>
+          </w:tcPr>
+          <w:p>
+            <w:pPr>
+              <w:jc w:val="left"/>
+            </w:pPr>
+            <w:r>
+              <w:rPr>
+                <w:rFonts w:ascii="Arial" w:cs="Arial" w:eastAsia="Arial" w:hAnsi="Arial"/>
+                <w:b w:val="false"/>
+                <w:bCs w:val="false"/>
+                <w:color w:val="000000"/>
+                <w:sz w:val="18"/>
+                <w:szCs w:val="18"/>
+              </w:rPr>
+              <w:t xml:space="preserve">rag_pipeline.py</w:t>
+            </w:r>
+          </w:p>
+        </w:tc>
+        <w:tc>
+          <w:tcPr>
+            <w:tcW w:type="dxa" w:w="800"/>
+            <w:tcBorders>
+              <w:top w:val="single" w:color="BDD7EE" w:sz="1"/>
+              <w:left w:val="single" w:color="BDD7EE" w:sz="1"/>
+              <w:bottom w:val="single" w:color="BDD7EE" w:sz="1"/>
+              <w:right w:val="single" w:color="BDD7EE" w:sz="1"/>
+            </w:tcBorders>
+            <w:shd w:fill="FFFFFF" w:val="clear"/>
+            <w:tcMar>
+              <w:top w:type="dxa" w:w="80"/>
+              <w:left w:type="dxa" w:w="150"/>
+              <w:bottom w:type="dxa" w:w="80"/>
+              <w:right w:type="dxa" w:w="150"/>
+            </w:tcMar>
+            <w:vAlign w:val="center"/>
+          </w:tcPr>
+          <w:p>
+            <w:pPr>
+              <w:jc w:val="left"/>
+            </w:pPr>
+            <w:r>
+              <w:rPr>
+                <w:rFonts w:ascii="Arial" w:cs="Arial" w:eastAsia="Arial" w:hAnsi="Arial"/>
+                <w:b w:val="false"/>
+                <w:bCs w:val="false"/>
+                <w:color w:val="000000"/>
+                <w:sz w:val="18"/>
+                <w:szCs w:val="18"/>
+              </w:rPr>
+              <w:t xml:space="preserve">85%</w:t>
             </w:r>
           </w:p>
         </w:tc>
@@ -18542,112 +18753,42 @@
                 <w:sz w:val="18"/>
                 <w:szCs w:val="18"/>
               </w:rPr>
-              <w:t xml:space="preserve">MiniLM-L6-v2 (384d)</w:t>
-            </w:r>
-          </w:p>
-        </w:tc>
-        <w:tc>
-          <w:tcPr>
-            <w:tcW w:type="dxa" w:w="2000"/>
-            <w:tcBorders>
-              <w:top w:val="single" w:color="BDD7EE" w:sz="1"/>
-              <w:left w:val="single" w:color="BDD7EE" w:sz="1"/>
-              <w:bottom w:val="single" w:color="BDD7EE" w:sz="1"/>
-              <w:right w:val="single" w:color="BDD7EE" w:sz="1"/>
-            </w:tcBorders>
-            <w:shd w:fill="FFFFFF" w:val="clear"/>
-            <w:tcMar>
-              <w:top w:type="dxa" w:w="80"/>
-              <w:left w:type="dxa" w:w="150"/>
-              <w:bottom w:type="dxa" w:w="80"/>
-              <w:right w:type="dxa" w:w="150"/>
-            </w:tcMar>
-            <w:vAlign w:val="center"/>
-          </w:tcPr>
-          <w:p>
-            <w:pPr>
-              <w:jc w:val="left"/>
-            </w:pPr>
-            <w:r>
-              <w:rPr>
-                <w:rFonts w:ascii="Arial" w:cs="Arial" w:eastAsia="Arial" w:hAnsi="Arial"/>
-                <w:b w:val="false"/>
-                <w:bCs w:val="false"/>
-                <w:color w:val="000000"/>
-                <w:sz w:val="18"/>
-                <w:szCs w:val="18"/>
-              </w:rPr>
-              <w:t xml:space="preserve">rag_pipeline.py</w:t>
-            </w:r>
-          </w:p>
-        </w:tc>
-        <w:tc>
-          <w:tcPr>
-            <w:tcW w:type="dxa" w:w="2000"/>
-            <w:tcBorders>
-              <w:top w:val="single" w:color="BDD7EE" w:sz="1"/>
-              <w:left w:val="single" w:color="BDD7EE" w:sz="1"/>
-              <w:bottom w:val="single" w:color="BDD7EE" w:sz="1"/>
-              <w:right w:val="single" w:color="BDD7EE" w:sz="1"/>
-            </w:tcBorders>
-            <w:shd w:fill="FFFFFF" w:val="clear"/>
-            <w:tcMar>
-              <w:top w:type="dxa" w:w="80"/>
-              <w:left w:type="dxa" w:w="150"/>
-              <w:bottom w:type="dxa" w:w="80"/>
-              <w:right w:type="dxa" w:w="150"/>
-            </w:tcMar>
-            <w:vAlign w:val="center"/>
-          </w:tcPr>
-          <w:p>
-            <w:pPr>
-              <w:jc w:val="left"/>
-            </w:pPr>
-            <w:r>
-              <w:rPr>
-                <w:rFonts w:ascii="Arial" w:cs="Arial" w:eastAsia="Arial" w:hAnsi="Arial"/>
-                <w:b w:val="false"/>
-                <w:bCs w:val="false"/>
-                <w:color w:val="000000"/>
-                <w:sz w:val="18"/>
-                <w:szCs w:val="18"/>
-              </w:rPr>
-              <w:t xml:space="preserve">85%</w:t>
-            </w:r>
-          </w:p>
-        </w:tc>
-        <w:tc>
-          <w:tcPr>
-            <w:tcW w:type="dxa" w:w="2880"/>
-            <w:tcBorders>
-              <w:top w:val="single" w:color="BDD7EE" w:sz="1"/>
-              <w:left w:val="single" w:color="BDD7EE" w:sz="1"/>
-              <w:bottom w:val="single" w:color="BDD7EE" w:sz="1"/>
-              <w:right w:val="single" w:color="BDD7EE" w:sz="1"/>
-            </w:tcBorders>
-            <w:shd w:fill="FFFFFF" w:val="clear"/>
-            <w:tcMar>
-              <w:top w:type="dxa" w:w="80"/>
-              <w:left w:type="dxa" w:w="150"/>
-              <w:bottom w:type="dxa" w:w="80"/>
-              <w:right w:type="dxa" w:w="150"/>
-            </w:tcMar>
-            <w:vAlign w:val="center"/>
-          </w:tcPr>
-          <w:p>
-            <w:pPr>
-              <w:jc w:val="left"/>
-            </w:pPr>
-            <w:r>
-              <w:rPr>
-                <w:rFonts w:ascii="Arial" w:cs="Arial" w:eastAsia="Arial" w:hAnsi="Arial"/>
-                <w:b w:val="false"/>
-                <w:bCs w:val="false"/>
-                <w:color w:val="000000"/>
-                <w:sz w:val="18"/>
-                <w:szCs w:val="18"/>
-              </w:rPr>
-              <w:t xml:space="preserve">Starting point. Q9, Q11, Q20 fail.</w:t>
+              <w:t xml:space="preserve">The simplest pipeline: convert all 20 cooking docs into numbers, store in a database, find the closest match when a question comes in, send it to Claude to answer.</w:t>
+            </w:r>
+          </w:p>
+        </w:tc>
+        <w:tc>
+          <w:tcPr>
+            <w:tcW w:type="dxa" w:w="2180"/>
+            <w:tcBorders>
+              <w:top w:val="single" w:color="BDD7EE" w:sz="1"/>
+              <w:left w:val="single" w:color="BDD7EE" w:sz="1"/>
+              <w:bottom w:val="single" w:color="BDD7EE" w:sz="1"/>
+              <w:right w:val="single" w:color="BDD7EE" w:sz="1"/>
+            </w:tcBorders>
+            <w:shd w:fill="FFFFFF" w:val="clear"/>
+            <w:tcMar>
+              <w:top w:type="dxa" w:w="80"/>
+              <w:left w:type="dxa" w:w="150"/>
+              <w:bottom w:type="dxa" w:w="80"/>
+              <w:right w:type="dxa" w:w="150"/>
+            </w:tcMar>
+            <w:vAlign w:val="center"/>
+          </w:tcPr>
+          <w:p>
+            <w:pPr>
+              <w:jc w:val="left"/>
+            </w:pPr>
+            <w:r>
+              <w:rPr>
+                <w:rFonts w:ascii="Arial" w:cs="Arial" w:eastAsia="Arial" w:hAnsi="Arial"/>
+                <w:b w:val="false"/>
+                <w:bCs w:val="false"/>
+                <w:color w:val="000000"/>
+                <w:sz w:val="18"/>
+                <w:szCs w:val="18"/>
+              </w:rPr>
+              <w:t xml:space="preserve">Q9, Q11, Q20 fail — retriever finds the wrong document.</w:t>
             </w:r>
           </w:p>
         </w:tc>
@@ -18655,7 +18796,7 @@
       <w:tr>
         <w:tc>
           <w:tcPr>
-            <w:tcW w:type="dxa" w:w="1000"/>
+            <w:tcW w:type="dxa" w:w="600"/>
             <w:tcBorders>
               <w:top w:val="single" w:color="BDD7EE" w:sz="1"/>
               <w:left w:val="single" w:color="BDD7EE" w:sz="1"/>
@@ -18690,6 +18831,146 @@
         </w:tc>
         <w:tc>
           <w:tcPr>
+            <w:tcW w:type="dxa" w:w="1400"/>
+            <w:tcBorders>
+              <w:top w:val="single" w:color="BDD7EE" w:sz="1"/>
+              <w:left w:val="single" w:color="BDD7EE" w:sz="1"/>
+              <w:bottom w:val="single" w:color="BDD7EE" w:sz="1"/>
+              <w:right w:val="single" w:color="BDD7EE" w:sz="1"/>
+            </w:tcBorders>
+            <w:shd w:fill="EBF3FB" w:val="clear"/>
+            <w:tcMar>
+              <w:top w:type="dxa" w:w="80"/>
+              <w:left w:type="dxa" w:w="150"/>
+              <w:bottom w:type="dxa" w:w="80"/>
+              <w:right w:type="dxa" w:w="150"/>
+            </w:tcMar>
+            <w:vAlign w:val="center"/>
+          </w:tcPr>
+          <w:p>
+            <w:pPr>
+              <w:jc w:val="left"/>
+            </w:pPr>
+            <w:r>
+              <w:rPr>
+                <w:rFonts w:ascii="Arial" w:cs="Arial" w:eastAsia="Arial" w:hAnsi="Arial"/>
+                <w:b w:val="false"/>
+                <w:bCs w:val="false"/>
+                <w:color w:val="000000"/>
+                <w:sz w:val="18"/>
+                <w:szCs w:val="18"/>
+              </w:rPr>
+              <w:t xml:space="preserve">Base — MiniLM (384d)</w:t>
+            </w:r>
+          </w:p>
+        </w:tc>
+        <w:tc>
+          <w:tcPr>
+            <w:tcW w:type="dxa" w:w="1500"/>
+            <w:tcBorders>
+              <w:top w:val="single" w:color="BDD7EE" w:sz="1"/>
+              <w:left w:val="single" w:color="BDD7EE" w:sz="1"/>
+              <w:bottom w:val="single" w:color="BDD7EE" w:sz="1"/>
+              <w:right w:val="single" w:color="BDD7EE" w:sz="1"/>
+            </w:tcBorders>
+            <w:shd w:fill="EBF3FB" w:val="clear"/>
+            <w:tcMar>
+              <w:top w:type="dxa" w:w="80"/>
+              <w:left w:type="dxa" w:w="150"/>
+              <w:bottom w:type="dxa" w:w="80"/>
+              <w:right w:type="dxa" w:w="150"/>
+            </w:tcMar>
+            <w:vAlign w:val="center"/>
+          </w:tcPr>
+          <w:p>
+            <w:pPr>
+              <w:jc w:val="left"/>
+            </w:pPr>
+            <w:r>
+              <w:rPr>
+                <w:rFonts w:ascii="Arial" w:cs="Arial" w:eastAsia="Arial" w:hAnsi="Arial"/>
+                <w:b w:val="false"/>
+                <w:bCs w:val="false"/>
+                <w:color w:val="000000"/>
+                <w:sz w:val="18"/>
+                <w:szCs w:val="18"/>
+              </w:rPr>
+              <w:t xml:space="preserve">BGE-large (1024d)</w:t>
+            </w:r>
+          </w:p>
+        </w:tc>
+        <w:tc>
+          <w:tcPr>
+            <w:tcW w:type="dxa" w:w="1400"/>
+            <w:tcBorders>
+              <w:top w:val="single" w:color="BDD7EE" w:sz="1"/>
+              <w:left w:val="single" w:color="BDD7EE" w:sz="1"/>
+              <w:bottom w:val="single" w:color="BDD7EE" w:sz="1"/>
+              <w:right w:val="single" w:color="BDD7EE" w:sz="1"/>
+            </w:tcBorders>
+            <w:shd w:fill="EBF3FB" w:val="clear"/>
+            <w:tcMar>
+              <w:top w:type="dxa" w:w="80"/>
+              <w:left w:type="dxa" w:w="150"/>
+              <w:bottom w:type="dxa" w:w="80"/>
+              <w:right w:type="dxa" w:w="150"/>
+            </w:tcMar>
+            <w:vAlign w:val="center"/>
+          </w:tcPr>
+          <w:p>
+            <w:pPr>
+              <w:jc w:val="left"/>
+            </w:pPr>
+            <w:r>
+              <w:rPr>
+                <w:rFonts w:ascii="Arial" w:cs="Arial" w:eastAsia="Arial" w:hAnsi="Arial"/>
+                <w:b w:val="false"/>
+                <w:bCs w:val="false"/>
+                <w:color w:val="000000"/>
+                <w:sz w:val="18"/>
+                <w:szCs w:val="18"/>
+              </w:rPr>
+              <w:t xml:space="preserve">build_index.py</w:t>
+            </w:r>
+          </w:p>
+        </w:tc>
+        <w:tc>
+          <w:tcPr>
+            <w:tcW w:type="dxa" w:w="800"/>
+            <w:tcBorders>
+              <w:top w:val="single" w:color="BDD7EE" w:sz="1"/>
+              <w:left w:val="single" w:color="BDD7EE" w:sz="1"/>
+              <w:bottom w:val="single" w:color="BDD7EE" w:sz="1"/>
+              <w:right w:val="single" w:color="BDD7EE" w:sz="1"/>
+            </w:tcBorders>
+            <w:shd w:fill="EBF3FB" w:val="clear"/>
+            <w:tcMar>
+              <w:top w:type="dxa" w:w="80"/>
+              <w:left w:type="dxa" w:w="150"/>
+              <w:bottom w:type="dxa" w:w="80"/>
+              <w:right w:type="dxa" w:w="150"/>
+            </w:tcMar>
+            <w:vAlign w:val="center"/>
+          </w:tcPr>
+          <w:p>
+            <w:pPr>
+              <w:jc w:val="left"/>
+            </w:pPr>
+            <w:r>
+              <w:rPr>
+                <w:rFonts w:ascii="Arial" w:cs="Arial" w:eastAsia="Arial" w:hAnsi="Arial"/>
+                <w:b w:val="false"/>
+                <w:bCs w:val="false"/>
+                <w:color w:val="000000"/>
+                <w:sz w:val="18"/>
+                <w:szCs w:val="18"/>
+              </w:rPr>
+              <w:t xml:space="preserve">95%</w:t>
+            </w:r>
+          </w:p>
+        </w:tc>
+        <w:tc>
+          <w:tcPr>
             <w:tcW w:type="dxa" w:w="2200"/>
             <w:tcBorders>
               <w:top w:val="single" w:color="BDD7EE" w:sz="1"/>
@@ -18719,112 +19000,42 @@
                 <w:sz w:val="18"/>
                 <w:szCs w:val="18"/>
               </w:rPr>
-              <w:t xml:space="preserve">BGE-large (1024d)</w:t>
-            </w:r>
-          </w:p>
-        </w:tc>
-        <w:tc>
-          <w:tcPr>
-            <w:tcW w:type="dxa" w:w="2000"/>
-            <w:tcBorders>
-              <w:top w:val="single" w:color="BDD7EE" w:sz="1"/>
-              <w:left w:val="single" w:color="BDD7EE" w:sz="1"/>
-              <w:bottom w:val="single" w:color="BDD7EE" w:sz="1"/>
-              <w:right w:val="single" w:color="BDD7EE" w:sz="1"/>
-            </w:tcBorders>
-            <w:shd w:fill="EBF3FB" w:val="clear"/>
-            <w:tcMar>
-              <w:top w:type="dxa" w:w="80"/>
-              <w:left w:type="dxa" w:w="150"/>
-              <w:bottom w:type="dxa" w:w="80"/>
-              <w:right w:type="dxa" w:w="150"/>
-            </w:tcMar>
-            <w:vAlign w:val="center"/>
-          </w:tcPr>
-          <w:p>
-            <w:pPr>
-              <w:jc w:val="left"/>
-            </w:pPr>
-            <w:r>
-              <w:rPr>
-                <w:rFonts w:ascii="Arial" w:cs="Arial" w:eastAsia="Arial" w:hAnsi="Arial"/>
-                <w:b w:val="false"/>
-                <w:bCs w:val="false"/>
-                <w:color w:val="000000"/>
-                <w:sz w:val="18"/>
-                <w:szCs w:val="18"/>
-              </w:rPr>
-              <w:t xml:space="preserve">build_index.py</w:t>
-            </w:r>
-          </w:p>
-        </w:tc>
-        <w:tc>
-          <w:tcPr>
-            <w:tcW w:type="dxa" w:w="2000"/>
-            <w:tcBorders>
-              <w:top w:val="single" w:color="BDD7EE" w:sz="1"/>
-              <w:left w:val="single" w:color="BDD7EE" w:sz="1"/>
-              <w:bottom w:val="single" w:color="BDD7EE" w:sz="1"/>
-              <w:right w:val="single" w:color="BDD7EE" w:sz="1"/>
-            </w:tcBorders>
-            <w:shd w:fill="EBF3FB" w:val="clear"/>
-            <w:tcMar>
-              <w:top w:type="dxa" w:w="80"/>
-              <w:left w:type="dxa" w:w="150"/>
-              <w:bottom w:type="dxa" w:w="80"/>
-              <w:right w:type="dxa" w:w="150"/>
-            </w:tcMar>
-            <w:vAlign w:val="center"/>
-          </w:tcPr>
-          <w:p>
-            <w:pPr>
-              <w:jc w:val="left"/>
-            </w:pPr>
-            <w:r>
-              <w:rPr>
-                <w:rFonts w:ascii="Arial" w:cs="Arial" w:eastAsia="Arial" w:hAnsi="Arial"/>
-                <w:b w:val="false"/>
-                <w:bCs w:val="false"/>
-                <w:color w:val="000000"/>
-                <w:sz w:val="18"/>
-                <w:szCs w:val="18"/>
-              </w:rPr>
-              <w:t xml:space="preserve">95%</w:t>
-            </w:r>
-          </w:p>
-        </w:tc>
-        <w:tc>
-          <w:tcPr>
-            <w:tcW w:type="dxa" w:w="2880"/>
-            <w:tcBorders>
-              <w:top w:val="single" w:color="BDD7EE" w:sz="1"/>
-              <w:left w:val="single" w:color="BDD7EE" w:sz="1"/>
-              <w:bottom w:val="single" w:color="BDD7EE" w:sz="1"/>
-              <w:right w:val="single" w:color="BDD7EE" w:sz="1"/>
-            </w:tcBorders>
-            <w:shd w:fill="EBF3FB" w:val="clear"/>
-            <w:tcMar>
-              <w:top w:type="dxa" w:w="80"/>
-              <w:left w:type="dxa" w:w="150"/>
-              <w:bottom w:type="dxa" w:w="80"/>
-              <w:right w:type="dxa" w:w="150"/>
-            </w:tcMar>
-            <w:vAlign w:val="center"/>
-          </w:tcPr>
-          <w:p>
-            <w:pPr>
-              <w:jc w:val="left"/>
-            </w:pPr>
-            <w:r>
-              <w:rPr>
-                <w:rFonts w:ascii="Arial" w:cs="Arial" w:eastAsia="Arial" w:hAnsi="Arial"/>
-                <w:b w:val="false"/>
-                <w:bCs w:val="false"/>
-                <w:color w:val="000000"/>
-                <w:sz w:val="18"/>
-                <w:szCs w:val="18"/>
-              </w:rPr>
-              <w:t xml:space="preserve">+10%. Better dims fix Q11, Q20.</w:t>
+              <w:t xml:space="preserve">We upgraded the tool that converts text into numbers. The new one creates richer, more detailed representations — 1024 numbers per doc instead of 384. Everything else is identical.</w:t>
+            </w:r>
+          </w:p>
+        </w:tc>
+        <w:tc>
+          <w:tcPr>
+            <w:tcW w:type="dxa" w:w="2180"/>
+            <w:tcBorders>
+              <w:top w:val="single" w:color="BDD7EE" w:sz="1"/>
+              <w:left w:val="single" w:color="BDD7EE" w:sz="1"/>
+              <w:bottom w:val="single" w:color="BDD7EE" w:sz="1"/>
+              <w:right w:val="single" w:color="BDD7EE" w:sz="1"/>
+            </w:tcBorders>
+            <w:shd w:fill="EBF3FB" w:val="clear"/>
+            <w:tcMar>
+              <w:top w:type="dxa" w:w="80"/>
+              <w:left w:type="dxa" w:w="150"/>
+              <w:bottom w:type="dxa" w:w="80"/>
+              <w:right w:type="dxa" w:w="150"/>
+            </w:tcMar>
+            <w:vAlign w:val="center"/>
+          </w:tcPr>
+          <w:p>
+            <w:pPr>
+              <w:jc w:val="left"/>
+            </w:pPr>
+            <w:r>
+              <w:rPr>
+                <w:rFonts w:ascii="Arial" w:cs="Arial" w:eastAsia="Arial" w:hAnsi="Arial"/>
+                <w:b w:val="false"/>
+                <w:bCs w:val="false"/>
+                <w:color w:val="000000"/>
+                <w:sz w:val="18"/>
+                <w:szCs w:val="18"/>
+              </w:rPr>
+              <w:t xml:space="preserve">+10%. Richer representations find better matches. Q11 and Q20 now retrieve the right doc.</w:t>
             </w:r>
           </w:p>
         </w:tc>
@@ -18832,7 +19043,7 @@
       <w:tr>
         <w:tc>
           <w:tcPr>
-            <w:tcW w:type="dxa" w:w="1000"/>
+            <w:tcW w:type="dxa" w:w="600"/>
             <w:tcBorders>
               <w:top w:val="single" w:color="BDD7EE" w:sz="1"/>
               <w:left w:val="single" w:color="BDD7EE" w:sz="1"/>
@@ -18867,6 +19078,146 @@
         </w:tc>
         <w:tc>
           <w:tcPr>
+            <w:tcW w:type="dxa" w:w="1400"/>
+            <w:tcBorders>
+              <w:top w:val="single" w:color="BDD7EE" w:sz="1"/>
+              <w:left w:val="single" w:color="BDD7EE" w:sz="1"/>
+              <w:bottom w:val="single" w:color="BDD7EE" w:sz="1"/>
+              <w:right w:val="single" w:color="BDD7EE" w:sz="1"/>
+            </w:tcBorders>
+            <w:shd w:fill="FFFFFF" w:val="clear"/>
+            <w:tcMar>
+              <w:top w:type="dxa" w:w="80"/>
+              <w:left w:type="dxa" w:w="150"/>
+              <w:bottom w:type="dxa" w:w="80"/>
+              <w:right w:type="dxa" w:w="150"/>
+            </w:tcMar>
+            <w:vAlign w:val="center"/>
+          </w:tcPr>
+          <w:p>
+            <w:pPr>
+              <w:jc w:val="left"/>
+            </w:pPr>
+            <w:r>
+              <w:rPr>
+                <w:rFonts w:ascii="Arial" w:cs="Arial" w:eastAsia="Arial" w:hAnsi="Arial"/>
+                <w:b w:val="false"/>
+                <w:bCs w:val="false"/>
+                <w:color w:val="000000"/>
+                <w:sz w:val="18"/>
+                <w:szCs w:val="18"/>
+              </w:rPr>
+              <w:t xml:space="preserve">6a — BGE-large</w:t>
+            </w:r>
+          </w:p>
+        </w:tc>
+        <w:tc>
+          <w:tcPr>
+            <w:tcW w:type="dxa" w:w="1500"/>
+            <w:tcBorders>
+              <w:top w:val="single" w:color="BDD7EE" w:sz="1"/>
+              <w:left w:val="single" w:color="BDD7EE" w:sz="1"/>
+              <w:bottom w:val="single" w:color="BDD7EE" w:sz="1"/>
+              <w:right w:val="single" w:color="BDD7EE" w:sz="1"/>
+            </w:tcBorders>
+            <w:shd w:fill="FFFFFF" w:val="clear"/>
+            <w:tcMar>
+              <w:top w:type="dxa" w:w="80"/>
+              <w:left w:type="dxa" w:w="150"/>
+              <w:bottom w:type="dxa" w:w="80"/>
+              <w:right w:type="dxa" w:w="150"/>
+            </w:tcMar>
+            <w:vAlign w:val="center"/>
+          </w:tcPr>
+          <w:p>
+            <w:pPr>
+              <w:jc w:val="left"/>
+            </w:pPr>
+            <w:r>
+              <w:rPr>
+                <w:rFonts w:ascii="Arial" w:cs="Arial" w:eastAsia="Arial" w:hAnsi="Arial"/>
+                <w:b w:val="false"/>
+                <w:bCs w:val="false"/>
+                <w:color w:val="000000"/>
+                <w:sz w:val="18"/>
+                <w:szCs w:val="18"/>
+              </w:rPr>
+              <w:t xml:space="preserve">HyDE</w:t>
+            </w:r>
+          </w:p>
+        </w:tc>
+        <w:tc>
+          <w:tcPr>
+            <w:tcW w:type="dxa" w:w="1400"/>
+            <w:tcBorders>
+              <w:top w:val="single" w:color="BDD7EE" w:sz="1"/>
+              <w:left w:val="single" w:color="BDD7EE" w:sz="1"/>
+              <w:bottom w:val="single" w:color="BDD7EE" w:sz="1"/>
+              <w:right w:val="single" w:color="BDD7EE" w:sz="1"/>
+            </w:tcBorders>
+            <w:shd w:fill="FFFFFF" w:val="clear"/>
+            <w:tcMar>
+              <w:top w:type="dxa" w:w="80"/>
+              <w:left w:type="dxa" w:w="150"/>
+              <w:bottom w:type="dxa" w:w="80"/>
+              <w:right w:type="dxa" w:w="150"/>
+            </w:tcMar>
+            <w:vAlign w:val="center"/>
+          </w:tcPr>
+          <w:p>
+            <w:pPr>
+              <w:jc w:val="left"/>
+            </w:pPr>
+            <w:r>
+              <w:rPr>
+                <w:rFonts w:ascii="Arial" w:cs="Arial" w:eastAsia="Arial" w:hAnsi="Arial"/>
+                <w:b w:val="false"/>
+                <w:bCs w:val="false"/>
+                <w:color w:val="000000"/>
+                <w:sz w:val="18"/>
+                <w:szCs w:val="18"/>
+              </w:rPr>
+              <w:t xml:space="preserve">hyde_pipeline.py</w:t>
+            </w:r>
+          </w:p>
+        </w:tc>
+        <w:tc>
+          <w:tcPr>
+            <w:tcW w:type="dxa" w:w="800"/>
+            <w:tcBorders>
+              <w:top w:val="single" w:color="BDD7EE" w:sz="1"/>
+              <w:left w:val="single" w:color="BDD7EE" w:sz="1"/>
+              <w:bottom w:val="single" w:color="BDD7EE" w:sz="1"/>
+              <w:right w:val="single" w:color="BDD7EE" w:sz="1"/>
+            </w:tcBorders>
+            <w:shd w:fill="FFFFFF" w:val="clear"/>
+            <w:tcMar>
+              <w:top w:type="dxa" w:w="80"/>
+              <w:left w:type="dxa" w:w="150"/>
+              <w:bottom w:type="dxa" w:w="80"/>
+              <w:right w:type="dxa" w:w="150"/>
+            </w:tcMar>
+            <w:vAlign w:val="center"/>
+          </w:tcPr>
+          <w:p>
+            <w:pPr>
+              <w:jc w:val="left"/>
+            </w:pPr>
+            <w:r>
+              <w:rPr>
+                <w:rFonts w:ascii="Arial" w:cs="Arial" w:eastAsia="Arial" w:hAnsi="Arial"/>
+                <w:b w:val="false"/>
+                <w:bCs w:val="false"/>
+                <w:color w:val="000000"/>
+                <w:sz w:val="18"/>
+                <w:szCs w:val="18"/>
+              </w:rPr>
+              <w:t xml:space="preserve">100%</w:t>
+            </w:r>
+          </w:p>
+        </w:tc>
+        <w:tc>
+          <w:tcPr>
             <w:tcW w:type="dxa" w:w="2200"/>
             <w:tcBorders>
               <w:top w:val="single" w:color="BDD7EE" w:sz="1"/>
@@ -18896,112 +19247,42 @@
                 <w:sz w:val="18"/>
                 <w:szCs w:val="18"/>
               </w:rPr>
-              <w:t xml:space="preserve">HyDE</w:t>
-            </w:r>
-          </w:p>
-        </w:tc>
-        <w:tc>
-          <w:tcPr>
-            <w:tcW w:type="dxa" w:w="2000"/>
-            <w:tcBorders>
-              <w:top w:val="single" w:color="BDD7EE" w:sz="1"/>
-              <w:left w:val="single" w:color="BDD7EE" w:sz="1"/>
-              <w:bottom w:val="single" w:color="BDD7EE" w:sz="1"/>
-              <w:right w:val="single" w:color="BDD7EE" w:sz="1"/>
-            </w:tcBorders>
-            <w:shd w:fill="FFFFFF" w:val="clear"/>
-            <w:tcMar>
-              <w:top w:type="dxa" w:w="80"/>
-              <w:left w:type="dxa" w:w="150"/>
-              <w:bottom w:type="dxa" w:w="80"/>
-              <w:right w:type="dxa" w:w="150"/>
-            </w:tcMar>
-            <w:vAlign w:val="center"/>
-          </w:tcPr>
-          <w:p>
-            <w:pPr>
-              <w:jc w:val="left"/>
-            </w:pPr>
-            <w:r>
-              <w:rPr>
-                <w:rFonts w:ascii="Arial" w:cs="Arial" w:eastAsia="Arial" w:hAnsi="Arial"/>
-                <w:b w:val="false"/>
-                <w:bCs w:val="false"/>
-                <w:color w:val="000000"/>
-                <w:sz w:val="18"/>
-                <w:szCs w:val="18"/>
-              </w:rPr>
-              <w:t xml:space="preserve">hyde_pipeline.py</w:t>
-            </w:r>
-          </w:p>
-        </w:tc>
-        <w:tc>
-          <w:tcPr>
-            <w:tcW w:type="dxa" w:w="2000"/>
-            <w:tcBorders>
-              <w:top w:val="single" w:color="BDD7EE" w:sz="1"/>
-              <w:left w:val="single" w:color="BDD7EE" w:sz="1"/>
-              <w:bottom w:val="single" w:color="BDD7EE" w:sz="1"/>
-              <w:right w:val="single" w:color="BDD7EE" w:sz="1"/>
-            </w:tcBorders>
-            <w:shd w:fill="FFFFFF" w:val="clear"/>
-            <w:tcMar>
-              <w:top w:type="dxa" w:w="80"/>
-              <w:left w:type="dxa" w:w="150"/>
-              <w:bottom w:type="dxa" w:w="80"/>
-              <w:right w:type="dxa" w:w="150"/>
-            </w:tcMar>
-            <w:vAlign w:val="center"/>
-          </w:tcPr>
-          <w:p>
-            <w:pPr>
-              <w:jc w:val="left"/>
-            </w:pPr>
-            <w:r>
-              <w:rPr>
-                <w:rFonts w:ascii="Arial" w:cs="Arial" w:eastAsia="Arial" w:hAnsi="Arial"/>
-                <w:b w:val="false"/>
-                <w:bCs w:val="false"/>
-                <w:color w:val="000000"/>
-                <w:sz w:val="18"/>
-                <w:szCs w:val="18"/>
-              </w:rPr>
-              <w:t xml:space="preserve">100%</w:t>
-            </w:r>
-          </w:p>
-        </w:tc>
-        <w:tc>
-          <w:tcPr>
-            <w:tcW w:type="dxa" w:w="2880"/>
-            <w:tcBorders>
-              <w:top w:val="single" w:color="BDD7EE" w:sz="1"/>
-              <w:left w:val="single" w:color="BDD7EE" w:sz="1"/>
-              <w:bottom w:val="single" w:color="BDD7EE" w:sz="1"/>
-              <w:right w:val="single" w:color="BDD7EE" w:sz="1"/>
-            </w:tcBorders>
-            <w:shd w:fill="FFFFFF" w:val="clear"/>
-            <w:tcMar>
-              <w:top w:type="dxa" w:w="80"/>
-              <w:left w:type="dxa" w:w="150"/>
-              <w:bottom w:type="dxa" w:w="80"/>
-              <w:right w:type="dxa" w:w="150"/>
-            </w:tcMar>
-            <w:vAlign w:val="center"/>
-          </w:tcPr>
-          <w:p>
-            <w:pPr>
-              <w:jc w:val="left"/>
-            </w:pPr>
-            <w:r>
-              <w:rPr>
-                <w:rFonts w:ascii="Arial" w:cs="Arial" w:eastAsia="Arial" w:hAnsi="Arial"/>
-                <w:b w:val="false"/>
-                <w:bCs w:val="false"/>
-                <w:color w:val="000000"/>
-                <w:sz w:val="18"/>
-                <w:szCs w:val="18"/>
-              </w:rPr>
-              <w:t xml:space="preserve">Generate hypothesis first → fix Q9 vocabulary gap.</w:t>
+              <w:t xml:space="preserve">Before searching, we ask Claude: 'What would a good answer look like?' We then search using that imagined answer instead of the raw question — bridging the gap when user words differ from document words.</w:t>
+            </w:r>
+          </w:p>
+        </w:tc>
+        <w:tc>
+          <w:tcPr>
+            <w:tcW w:type="dxa" w:w="2180"/>
+            <w:tcBorders>
+              <w:top w:val="single" w:color="BDD7EE" w:sz="1"/>
+              <w:left w:val="single" w:color="BDD7EE" w:sz="1"/>
+              <w:bottom w:val="single" w:color="BDD7EE" w:sz="1"/>
+              <w:right w:val="single" w:color="BDD7EE" w:sz="1"/>
+            </w:tcBorders>
+            <w:shd w:fill="FFFFFF" w:val="clear"/>
+            <w:tcMar>
+              <w:top w:type="dxa" w:w="80"/>
+              <w:left w:type="dxa" w:w="150"/>
+              <w:bottom w:type="dxa" w:w="80"/>
+              <w:right w:type="dxa" w:w="150"/>
+            </w:tcMar>
+            <w:vAlign w:val="center"/>
+          </w:tcPr>
+          <w:p>
+            <w:pPr>
+              <w:jc w:val="left"/>
+            </w:pPr>
+            <w:r>
+              <w:rPr>
+                <w:rFonts w:ascii="Arial" w:cs="Arial" w:eastAsia="Arial" w:hAnsi="Arial"/>
+                <w:b w:val="false"/>
+                <w:bCs w:val="false"/>
+                <w:color w:val="000000"/>
+                <w:sz w:val="18"/>
+                <w:szCs w:val="18"/>
+              </w:rPr>
+              <w:t xml:space="preserve">Q9 fixed — 'how to make pan sauce' matched 'deglazing fond' because the hypothetical answer used document-style language.</w:t>
             </w:r>
           </w:p>
         </w:tc>
@@ -19009,7 +19290,7 @@
       <w:tr>
         <w:tc>
           <w:tcPr>
-            <w:tcW w:type="dxa" w:w="1000"/>
+            <w:tcW w:type="dxa" w:w="600"/>
             <w:tcBorders>
               <w:top w:val="single" w:color="BDD7EE" w:sz="1"/>
               <w:left w:val="single" w:color="BDD7EE" w:sz="1"/>
@@ -19044,6 +19325,146 @@
         </w:tc>
         <w:tc>
           <w:tcPr>
+            <w:tcW w:type="dxa" w:w="1400"/>
+            <w:tcBorders>
+              <w:top w:val="single" w:color="BDD7EE" w:sz="1"/>
+              <w:left w:val="single" w:color="BDD7EE" w:sz="1"/>
+              <w:bottom w:val="single" w:color="BDD7EE" w:sz="1"/>
+              <w:right w:val="single" w:color="BDD7EE" w:sz="1"/>
+            </w:tcBorders>
+            <w:shd w:fill="EBF3FB" w:val="clear"/>
+            <w:tcMar>
+              <w:top w:type="dxa" w:w="80"/>
+              <w:left w:type="dxa" w:w="150"/>
+              <w:bottom w:type="dxa" w:w="80"/>
+              <w:right w:type="dxa" w:w="150"/>
+            </w:tcMar>
+            <w:vAlign w:val="center"/>
+          </w:tcPr>
+          <w:p>
+            <w:pPr>
+              <w:jc w:val="left"/>
+            </w:pPr>
+            <w:r>
+              <w:rPr>
+                <w:rFonts w:ascii="Arial" w:cs="Arial" w:eastAsia="Arial" w:hAnsi="Arial"/>
+                <w:b w:val="false"/>
+                <w:bCs w:val="false"/>
+                <w:color w:val="000000"/>
+                <w:sz w:val="18"/>
+                <w:szCs w:val="18"/>
+              </w:rPr>
+              <w:t xml:space="preserve">6a — BGE-large</w:t>
+            </w:r>
+          </w:p>
+        </w:tc>
+        <w:tc>
+          <w:tcPr>
+            <w:tcW w:type="dxa" w:w="1500"/>
+            <w:tcBorders>
+              <w:top w:val="single" w:color="BDD7EE" w:sz="1"/>
+              <w:left w:val="single" w:color="BDD7EE" w:sz="1"/>
+              <w:bottom w:val="single" w:color="BDD7EE" w:sz="1"/>
+              <w:right w:val="single" w:color="BDD7EE" w:sz="1"/>
+            </w:tcBorders>
+            <w:shd w:fill="EBF3FB" w:val="clear"/>
+            <w:tcMar>
+              <w:top w:type="dxa" w:w="80"/>
+              <w:left w:type="dxa" w:w="150"/>
+              <w:bottom w:type="dxa" w:w="80"/>
+              <w:right w:type="dxa" w:w="150"/>
+            </w:tcMar>
+            <w:vAlign w:val="center"/>
+          </w:tcPr>
+          <w:p>
+            <w:pPr>
+              <w:jc w:val="left"/>
+            </w:pPr>
+            <w:r>
+              <w:rPr>
+                <w:rFonts w:ascii="Arial" w:cs="Arial" w:eastAsia="Arial" w:hAnsi="Arial"/>
+                <w:b w:val="false"/>
+                <w:bCs w:val="false"/>
+                <w:color w:val="000000"/>
+                <w:sz w:val="18"/>
+                <w:szCs w:val="18"/>
+              </w:rPr>
+              <w:t xml:space="preserve">Re-ranking</w:t>
+            </w:r>
+          </w:p>
+        </w:tc>
+        <w:tc>
+          <w:tcPr>
+            <w:tcW w:type="dxa" w:w="1400"/>
+            <w:tcBorders>
+              <w:top w:val="single" w:color="BDD7EE" w:sz="1"/>
+              <w:left w:val="single" w:color="BDD7EE" w:sz="1"/>
+              <w:bottom w:val="single" w:color="BDD7EE" w:sz="1"/>
+              <w:right w:val="single" w:color="BDD7EE" w:sz="1"/>
+            </w:tcBorders>
+            <w:shd w:fill="EBF3FB" w:val="clear"/>
+            <w:tcMar>
+              <w:top w:type="dxa" w:w="80"/>
+              <w:left w:type="dxa" w:w="150"/>
+              <w:bottom w:type="dxa" w:w="80"/>
+              <w:right w:type="dxa" w:w="150"/>
+            </w:tcMar>
+            <w:vAlign w:val="center"/>
+          </w:tcPr>
+          <w:p>
+            <w:pPr>
+              <w:jc w:val="left"/>
+            </w:pPr>
+            <w:r>
+              <w:rPr>
+                <w:rFonts w:ascii="Arial" w:cs="Arial" w:eastAsia="Arial" w:hAnsi="Arial"/>
+                <w:b w:val="false"/>
+                <w:bCs w:val="false"/>
+                <w:color w:val="000000"/>
+                <w:sz w:val="18"/>
+                <w:szCs w:val="18"/>
+              </w:rPr>
+              <w:t xml:space="preserve">rerank_pipeline.py</w:t>
+            </w:r>
+          </w:p>
+        </w:tc>
+        <w:tc>
+          <w:tcPr>
+            <w:tcW w:type="dxa" w:w="800"/>
+            <w:tcBorders>
+              <w:top w:val="single" w:color="BDD7EE" w:sz="1"/>
+              <w:left w:val="single" w:color="BDD7EE" w:sz="1"/>
+              <w:bottom w:val="single" w:color="BDD7EE" w:sz="1"/>
+              <w:right w:val="single" w:color="BDD7EE" w:sz="1"/>
+            </w:tcBorders>
+            <w:shd w:fill="EBF3FB" w:val="clear"/>
+            <w:tcMar>
+              <w:top w:type="dxa" w:w="80"/>
+              <w:left w:type="dxa" w:w="150"/>
+              <w:bottom w:type="dxa" w:w="80"/>
+              <w:right w:type="dxa" w:w="150"/>
+            </w:tcMar>
+            <w:vAlign w:val="center"/>
+          </w:tcPr>
+          <w:p>
+            <w:pPr>
+              <w:jc w:val="left"/>
+            </w:pPr>
+            <w:r>
+              <w:rPr>
+                <w:rFonts w:ascii="Arial" w:cs="Arial" w:eastAsia="Arial" w:hAnsi="Arial"/>
+                <w:b w:val="false"/>
+                <w:bCs w:val="false"/>
+                <w:color w:val="000000"/>
+                <w:sz w:val="18"/>
+                <w:szCs w:val="18"/>
+              </w:rPr>
+              <w:t xml:space="preserve">90%</w:t>
+            </w:r>
+          </w:p>
+        </w:tc>
+        <w:tc>
+          <w:tcPr>
             <w:tcW w:type="dxa" w:w="2200"/>
             <w:tcBorders>
               <w:top w:val="single" w:color="BDD7EE" w:sz="1"/>
@@ -19073,112 +19494,42 @@
                 <w:sz w:val="18"/>
                 <w:szCs w:val="18"/>
               </w:rPr>
-              <w:t xml:space="preserve">Re-ranking</w:t>
-            </w:r>
-          </w:p>
-        </w:tc>
-        <w:tc>
-          <w:tcPr>
-            <w:tcW w:type="dxa" w:w="2000"/>
-            <w:tcBorders>
-              <w:top w:val="single" w:color="BDD7EE" w:sz="1"/>
-              <w:left w:val="single" w:color="BDD7EE" w:sz="1"/>
-              <w:bottom w:val="single" w:color="BDD7EE" w:sz="1"/>
-              <w:right w:val="single" w:color="BDD7EE" w:sz="1"/>
-            </w:tcBorders>
-            <w:shd w:fill="EBF3FB" w:val="clear"/>
-            <w:tcMar>
-              <w:top w:type="dxa" w:w="80"/>
-              <w:left w:type="dxa" w:w="150"/>
-              <w:bottom w:type="dxa" w:w="80"/>
-              <w:right w:type="dxa" w:w="150"/>
-            </w:tcMar>
-            <w:vAlign w:val="center"/>
-          </w:tcPr>
-          <w:p>
-            <w:pPr>
-              <w:jc w:val="left"/>
-            </w:pPr>
-            <w:r>
-              <w:rPr>
-                <w:rFonts w:ascii="Arial" w:cs="Arial" w:eastAsia="Arial" w:hAnsi="Arial"/>
-                <w:b w:val="false"/>
-                <w:bCs w:val="false"/>
-                <w:color w:val="000000"/>
-                <w:sz w:val="18"/>
-                <w:szCs w:val="18"/>
-              </w:rPr>
-              <w:t xml:space="preserve">rerank_pipeline.py</w:t>
-            </w:r>
-          </w:p>
-        </w:tc>
-        <w:tc>
-          <w:tcPr>
-            <w:tcW w:type="dxa" w:w="2000"/>
-            <w:tcBorders>
-              <w:top w:val="single" w:color="BDD7EE" w:sz="1"/>
-              <w:left w:val="single" w:color="BDD7EE" w:sz="1"/>
-              <w:bottom w:val="single" w:color="BDD7EE" w:sz="1"/>
-              <w:right w:val="single" w:color="BDD7EE" w:sz="1"/>
-            </w:tcBorders>
-            <w:shd w:fill="EBF3FB" w:val="clear"/>
-            <w:tcMar>
-              <w:top w:type="dxa" w:w="80"/>
-              <w:left w:type="dxa" w:w="150"/>
-              <w:bottom w:type="dxa" w:w="80"/>
-              <w:right w:type="dxa" w:w="150"/>
-            </w:tcMar>
-            <w:vAlign w:val="center"/>
-          </w:tcPr>
-          <w:p>
-            <w:pPr>
-              <w:jc w:val="left"/>
-            </w:pPr>
-            <w:r>
-              <w:rPr>
-                <w:rFonts w:ascii="Arial" w:cs="Arial" w:eastAsia="Arial" w:hAnsi="Arial"/>
-                <w:b w:val="false"/>
-                <w:bCs w:val="false"/>
-                <w:color w:val="000000"/>
-                <w:sz w:val="18"/>
-                <w:szCs w:val="18"/>
-              </w:rPr>
-              <w:t xml:space="preserve">90%</w:t>
-            </w:r>
-          </w:p>
-        </w:tc>
-        <w:tc>
-          <w:tcPr>
-            <w:tcW w:type="dxa" w:w="2880"/>
-            <w:tcBorders>
-              <w:top w:val="single" w:color="BDD7EE" w:sz="1"/>
-              <w:left w:val="single" w:color="BDD7EE" w:sz="1"/>
-              <w:bottom w:val="single" w:color="BDD7EE" w:sz="1"/>
-              <w:right w:val="single" w:color="BDD7EE" w:sz="1"/>
-            </w:tcBorders>
-            <w:shd w:fill="EBF3FB" w:val="clear"/>
-            <w:tcMar>
-              <w:top w:type="dxa" w:w="80"/>
-              <w:left w:type="dxa" w:w="150"/>
-              <w:bottom w:type="dxa" w:w="80"/>
-              <w:right w:type="dxa" w:w="150"/>
-            </w:tcMar>
-            <w:vAlign w:val="center"/>
-          </w:tcPr>
-          <w:p>
-            <w:pPr>
-              <w:jc w:val="left"/>
-            </w:pPr>
-            <w:r>
-              <w:rPr>
-                <w:rFonts w:ascii="Arial" w:cs="Arial" w:eastAsia="Arial" w:hAnsi="Arial"/>
-                <w:b w:val="false"/>
-                <w:bCs w:val="false"/>
-                <w:color w:val="000000"/>
-                <w:sz w:val="18"/>
-                <w:szCs w:val="18"/>
-              </w:rPr>
-              <w:t xml:space="preserve">-5%. Cross-encoder out-of-domain on small corpus.</w:t>
+              <w:t xml:space="preserve">We retrieve the top results as usual, then pass them through a second judge that re-reads and re-orders them by actual relevance. Think of it as a second opinion after the first search.</w:t>
+            </w:r>
+          </w:p>
+        </w:tc>
+        <w:tc>
+          <w:tcPr>
+            <w:tcW w:type="dxa" w:w="2180"/>
+            <w:tcBorders>
+              <w:top w:val="single" w:color="BDD7EE" w:sz="1"/>
+              <w:left w:val="single" w:color="BDD7EE" w:sz="1"/>
+              <w:bottom w:val="single" w:color="BDD7EE" w:sz="1"/>
+              <w:right w:val="single" w:color="BDD7EE" w:sz="1"/>
+            </w:tcBorders>
+            <w:shd w:fill="EBF3FB" w:val="clear"/>
+            <w:tcMar>
+              <w:top w:type="dxa" w:w="80"/>
+              <w:left w:type="dxa" w:w="150"/>
+              <w:bottom w:type="dxa" w:w="80"/>
+              <w:right w:type="dxa" w:w="150"/>
+            </w:tcMar>
+            <w:vAlign w:val="center"/>
+          </w:tcPr>
+          <w:p>
+            <w:pPr>
+              <w:jc w:val="left"/>
+            </w:pPr>
+            <w:r>
+              <w:rPr>
+                <w:rFonts w:ascii="Arial" w:cs="Arial" w:eastAsia="Arial" w:hAnsi="Arial"/>
+                <w:b w:val="false"/>
+                <w:bCs w:val="false"/>
+                <w:color w:val="000000"/>
+                <w:sz w:val="18"/>
+                <w:szCs w:val="18"/>
+              </w:rPr>
+              <w:t xml:space="preserve">-5%. The second judge was trained on general text, not cooking — it made things worse on our small specialized corpus.</w:t>
             </w:r>
           </w:p>
         </w:tc>
@@ -19186,7 +19537,7 @@
       <w:tr>
         <w:tc>
           <w:tcPr>
-            <w:tcW w:type="dxa" w:w="1000"/>
+            <w:tcW w:type="dxa" w:w="600"/>
             <w:tcBorders>
               <w:top w:val="single" w:color="BDD7EE" w:sz="1"/>
               <w:left w:val="single" w:color="BDD7EE" w:sz="1"/>
@@ -19221,6 +19572,146 @@
         </w:tc>
         <w:tc>
           <w:tcPr>
+            <w:tcW w:type="dxa" w:w="1400"/>
+            <w:tcBorders>
+              <w:top w:val="single" w:color="BDD7EE" w:sz="1"/>
+              <w:left w:val="single" w:color="BDD7EE" w:sz="1"/>
+              <w:bottom w:val="single" w:color="BDD7EE" w:sz="1"/>
+              <w:right w:val="single" w:color="BDD7EE" w:sz="1"/>
+            </w:tcBorders>
+            <w:shd w:fill="FFFFFF" w:val="clear"/>
+            <w:tcMar>
+              <w:top w:type="dxa" w:w="80"/>
+              <w:left w:type="dxa" w:w="150"/>
+              <w:bottom w:type="dxa" w:w="80"/>
+              <w:right w:type="dxa" w:w="150"/>
+            </w:tcMar>
+            <w:vAlign w:val="center"/>
+          </w:tcPr>
+          <w:p>
+            <w:pPr>
+              <w:jc w:val="left"/>
+            </w:pPr>
+            <w:r>
+              <w:rPr>
+                <w:rFonts w:ascii="Arial" w:cs="Arial" w:eastAsia="Arial" w:hAnsi="Arial"/>
+                <w:b w:val="false"/>
+                <w:bCs w:val="false"/>
+                <w:color w:val="000000"/>
+                <w:sz w:val="18"/>
+                <w:szCs w:val="18"/>
+              </w:rPr>
+              <w:t xml:space="preserve">6a — BGE-large</w:t>
+            </w:r>
+          </w:p>
+        </w:tc>
+        <w:tc>
+          <w:tcPr>
+            <w:tcW w:type="dxa" w:w="1500"/>
+            <w:tcBorders>
+              <w:top w:val="single" w:color="BDD7EE" w:sz="1"/>
+              <w:left w:val="single" w:color="BDD7EE" w:sz="1"/>
+              <w:bottom w:val="single" w:color="BDD7EE" w:sz="1"/>
+              <w:right w:val="single" w:color="BDD7EE" w:sz="1"/>
+            </w:tcBorders>
+            <w:shd w:fill="FFFFFF" w:val="clear"/>
+            <w:tcMar>
+              <w:top w:type="dxa" w:w="80"/>
+              <w:left w:type="dxa" w:w="150"/>
+              <w:bottom w:type="dxa" w:w="80"/>
+              <w:right w:type="dxa" w:w="150"/>
+            </w:tcMar>
+            <w:vAlign w:val="center"/>
+          </w:tcPr>
+          <w:p>
+            <w:pPr>
+              <w:jc w:val="left"/>
+            </w:pPr>
+            <w:r>
+              <w:rPr>
+                <w:rFonts w:ascii="Arial" w:cs="Arial" w:eastAsia="Arial" w:hAnsi="Arial"/>
+                <w:b w:val="false"/>
+                <w:bCs w:val="false"/>
+                <w:color w:val="000000"/>
+                <w:sz w:val="18"/>
+                <w:szCs w:val="18"/>
+              </w:rPr>
+              <w:t xml:space="preserve">Branched RAG</w:t>
+            </w:r>
+          </w:p>
+        </w:tc>
+        <w:tc>
+          <w:tcPr>
+            <w:tcW w:type="dxa" w:w="1400"/>
+            <w:tcBorders>
+              <w:top w:val="single" w:color="BDD7EE" w:sz="1"/>
+              <w:left w:val="single" w:color="BDD7EE" w:sz="1"/>
+              <w:bottom w:val="single" w:color="BDD7EE" w:sz="1"/>
+              <w:right w:val="single" w:color="BDD7EE" w:sz="1"/>
+            </w:tcBorders>
+            <w:shd w:fill="FFFFFF" w:val="clear"/>
+            <w:tcMar>
+              <w:top w:type="dxa" w:w="80"/>
+              <w:left w:type="dxa" w:w="150"/>
+              <w:bottom w:type="dxa" w:w="80"/>
+              <w:right w:type="dxa" w:w="150"/>
+            </w:tcMar>
+            <w:vAlign w:val="center"/>
+          </w:tcPr>
+          <w:p>
+            <w:pPr>
+              <w:jc w:val="left"/>
+            </w:pPr>
+            <w:r>
+              <w:rPr>
+                <w:rFonts w:ascii="Arial" w:cs="Arial" w:eastAsia="Arial" w:hAnsi="Arial"/>
+                <w:b w:val="false"/>
+                <w:bCs w:val="false"/>
+                <w:color w:val="000000"/>
+                <w:sz w:val="18"/>
+                <w:szCs w:val="18"/>
+              </w:rPr>
+              <w:t xml:space="preserve">branched_pipeline.py</w:t>
+            </w:r>
+          </w:p>
+        </w:tc>
+        <w:tc>
+          <w:tcPr>
+            <w:tcW w:type="dxa" w:w="800"/>
+            <w:tcBorders>
+              <w:top w:val="single" w:color="BDD7EE" w:sz="1"/>
+              <w:left w:val="single" w:color="BDD7EE" w:sz="1"/>
+              <w:bottom w:val="single" w:color="BDD7EE" w:sz="1"/>
+              <w:right w:val="single" w:color="BDD7EE" w:sz="1"/>
+            </w:tcBorders>
+            <w:shd w:fill="FFFFFF" w:val="clear"/>
+            <w:tcMar>
+              <w:top w:type="dxa" w:w="80"/>
+              <w:left w:type="dxa" w:w="150"/>
+              <w:bottom w:type="dxa" w:w="80"/>
+              <w:right w:type="dxa" w:w="150"/>
+            </w:tcMar>
+            <w:vAlign w:val="center"/>
+          </w:tcPr>
+          <w:p>
+            <w:pPr>
+              <w:jc w:val="left"/>
+            </w:pPr>
+            <w:r>
+              <w:rPr>
+                <w:rFonts w:ascii="Arial" w:cs="Arial" w:eastAsia="Arial" w:hAnsi="Arial"/>
+                <w:b w:val="false"/>
+                <w:bCs w:val="false"/>
+                <w:color w:val="000000"/>
+                <w:sz w:val="18"/>
+                <w:szCs w:val="18"/>
+              </w:rPr>
+              <w:t xml:space="preserve">95%</w:t>
+            </w:r>
+          </w:p>
+        </w:tc>
+        <w:tc>
+          <w:tcPr>
             <w:tcW w:type="dxa" w:w="2200"/>
             <w:tcBorders>
               <w:top w:val="single" w:color="BDD7EE" w:sz="1"/>
@@ -19250,112 +19741,42 @@
                 <w:sz w:val="18"/>
                 <w:szCs w:val="18"/>
               </w:rPr>
-              <w:t xml:space="preserve">Branched RAG</w:t>
-            </w:r>
-          </w:p>
-        </w:tc>
-        <w:tc>
-          <w:tcPr>
-            <w:tcW w:type="dxa" w:w="2000"/>
-            <w:tcBorders>
-              <w:top w:val="single" w:color="BDD7EE" w:sz="1"/>
-              <w:left w:val="single" w:color="BDD7EE" w:sz="1"/>
-              <w:bottom w:val="single" w:color="BDD7EE" w:sz="1"/>
-              <w:right w:val="single" w:color="BDD7EE" w:sz="1"/>
-            </w:tcBorders>
-            <w:shd w:fill="FFFFFF" w:val="clear"/>
-            <w:tcMar>
-              <w:top w:type="dxa" w:w="80"/>
-              <w:left w:type="dxa" w:w="150"/>
-              <w:bottom w:type="dxa" w:w="80"/>
-              <w:right w:type="dxa" w:w="150"/>
-            </w:tcMar>
-            <w:vAlign w:val="center"/>
-          </w:tcPr>
-          <w:p>
-            <w:pPr>
-              <w:jc w:val="left"/>
-            </w:pPr>
-            <w:r>
-              <w:rPr>
-                <w:rFonts w:ascii="Arial" w:cs="Arial" w:eastAsia="Arial" w:hAnsi="Arial"/>
-                <w:b w:val="false"/>
-                <w:bCs w:val="false"/>
-                <w:color w:val="000000"/>
-                <w:sz w:val="18"/>
-                <w:szCs w:val="18"/>
-              </w:rPr>
-              <w:t xml:space="preserve">branched_pipeline.py</w:t>
-            </w:r>
-          </w:p>
-        </w:tc>
-        <w:tc>
-          <w:tcPr>
-            <w:tcW w:type="dxa" w:w="2000"/>
-            <w:tcBorders>
-              <w:top w:val="single" w:color="BDD7EE" w:sz="1"/>
-              <w:left w:val="single" w:color="BDD7EE" w:sz="1"/>
-              <w:bottom w:val="single" w:color="BDD7EE" w:sz="1"/>
-              <w:right w:val="single" w:color="BDD7EE" w:sz="1"/>
-            </w:tcBorders>
-            <w:shd w:fill="FFFFFF" w:val="clear"/>
-            <w:tcMar>
-              <w:top w:type="dxa" w:w="80"/>
-              <w:left w:type="dxa" w:w="150"/>
-              <w:bottom w:type="dxa" w:w="80"/>
-              <w:right w:type="dxa" w:w="150"/>
-            </w:tcMar>
-            <w:vAlign w:val="center"/>
-          </w:tcPr>
-          <w:p>
-            <w:pPr>
-              <w:jc w:val="left"/>
-            </w:pPr>
-            <w:r>
-              <w:rPr>
-                <w:rFonts w:ascii="Arial" w:cs="Arial" w:eastAsia="Arial" w:hAnsi="Arial"/>
-                <w:b w:val="false"/>
-                <w:bCs w:val="false"/>
-                <w:color w:val="000000"/>
-                <w:sz w:val="18"/>
-                <w:szCs w:val="18"/>
-              </w:rPr>
-              <w:t xml:space="preserve">95%</w:t>
-            </w:r>
-          </w:p>
-        </w:tc>
-        <w:tc>
-          <w:tcPr>
-            <w:tcW w:type="dxa" w:w="2880"/>
-            <w:tcBorders>
-              <w:top w:val="single" w:color="BDD7EE" w:sz="1"/>
-              <w:left w:val="single" w:color="BDD7EE" w:sz="1"/>
-              <w:bottom w:val="single" w:color="BDD7EE" w:sz="1"/>
-              <w:right w:val="single" w:color="BDD7EE" w:sz="1"/>
-            </w:tcBorders>
-            <w:shd w:fill="FFFFFF" w:val="clear"/>
-            <w:tcMar>
-              <w:top w:type="dxa" w:w="80"/>
-              <w:left w:type="dxa" w:w="150"/>
-              <w:bottom w:type="dxa" w:w="80"/>
-              <w:right w:type="dxa" w:w="150"/>
-            </w:tcMar>
-            <w:vAlign w:val="center"/>
-          </w:tcPr>
-          <w:p>
-            <w:pPr>
-              <w:jc w:val="left"/>
-            </w:pPr>
-            <w:r>
-              <w:rPr>
-                <w:rFonts w:ascii="Arial" w:cs="Arial" w:eastAsia="Arial" w:hAnsi="Arial"/>
-                <w:b w:val="false"/>
-                <w:bCs w:val="false"/>
-                <w:color w:val="000000"/>
-                <w:sz w:val="18"/>
-                <w:szCs w:val="18"/>
-              </w:rPr>
-              <w:t xml:space="preserve">Vector + BM25 + RRF. Additive, no regression.</w:t>
+              <w:t xml:space="preserve">Instead of one search, we run two at the same time: one finds docs by meaning (vector), one finds docs by exact words (keyword). We combine both result lists into one ranked list.</w:t>
+            </w:r>
+          </w:p>
+        </w:tc>
+        <w:tc>
+          <w:tcPr>
+            <w:tcW w:type="dxa" w:w="2180"/>
+            <w:tcBorders>
+              <w:top w:val="single" w:color="BDD7EE" w:sz="1"/>
+              <w:left w:val="single" w:color="BDD7EE" w:sz="1"/>
+              <w:bottom w:val="single" w:color="BDD7EE" w:sz="1"/>
+              <w:right w:val="single" w:color="BDD7EE" w:sz="1"/>
+            </w:tcBorders>
+            <w:shd w:fill="FFFFFF" w:val="clear"/>
+            <w:tcMar>
+              <w:top w:type="dxa" w:w="80"/>
+              <w:left w:type="dxa" w:w="150"/>
+              <w:bottom w:type="dxa" w:w="80"/>
+              <w:right w:type="dxa" w:w="150"/>
+            </w:tcMar>
+            <w:vAlign w:val="center"/>
+          </w:tcPr>
+          <w:p>
+            <w:pPr>
+              <w:jc w:val="left"/>
+            </w:pPr>
+            <w:r>
+              <w:rPr>
+                <w:rFonts w:ascii="Arial" w:cs="Arial" w:eastAsia="Arial" w:hAnsi="Arial"/>
+                <w:b w:val="false"/>
+                <w:bCs w:val="false"/>
+                <w:color w:val="000000"/>
+                <w:sz w:val="18"/>
+                <w:szCs w:val="18"/>
+              </w:rPr>
+              <w:t xml:space="preserve">Having two search types is additive — keyword search catches what meaning-search misses, with no accuracy loss.</w:t>
             </w:r>
           </w:p>
         </w:tc>
@@ -19363,7 +19784,7 @@
       <w:tr>
         <w:tc>
           <w:tcPr>
-            <w:tcW w:type="dxa" w:w="1000"/>
+            <w:tcW w:type="dxa" w:w="600"/>
             <w:tcBorders>
               <w:top w:val="single" w:color="BDD7EE" w:sz="1"/>
               <w:left w:val="single" w:color="BDD7EE" w:sz="1"/>
@@ -19398,6 +19819,146 @@
         </w:tc>
         <w:tc>
           <w:tcPr>
+            <w:tcW w:type="dxa" w:w="1400"/>
+            <w:tcBorders>
+              <w:top w:val="single" w:color="BDD7EE" w:sz="1"/>
+              <w:left w:val="single" w:color="BDD7EE" w:sz="1"/>
+              <w:bottom w:val="single" w:color="BDD7EE" w:sz="1"/>
+              <w:right w:val="single" w:color="BDD7EE" w:sz="1"/>
+            </w:tcBorders>
+            <w:shd w:fill="EBF3FB" w:val="clear"/>
+            <w:tcMar>
+              <w:top w:type="dxa" w:w="80"/>
+              <w:left w:type="dxa" w:w="150"/>
+              <w:bottom w:type="dxa" w:w="80"/>
+              <w:right w:type="dxa" w:w="150"/>
+            </w:tcMar>
+            <w:vAlign w:val="center"/>
+          </w:tcPr>
+          <w:p>
+            <w:pPr>
+              <w:jc w:val="left"/>
+            </w:pPr>
+            <w:r>
+              <w:rPr>
+                <w:rFonts w:ascii="Arial" w:cs="Arial" w:eastAsia="Arial" w:hAnsi="Arial"/>
+                <w:b w:val="false"/>
+                <w:bCs w:val="false"/>
+                <w:color w:val="000000"/>
+                <w:sz w:val="18"/>
+                <w:szCs w:val="18"/>
+              </w:rPr>
+              <w:t xml:space="preserve">6d — Branched RAG</w:t>
+            </w:r>
+          </w:p>
+        </w:tc>
+        <w:tc>
+          <w:tcPr>
+            <w:tcW w:type="dxa" w:w="1500"/>
+            <w:tcBorders>
+              <w:top w:val="single" w:color="BDD7EE" w:sz="1"/>
+              <w:left w:val="single" w:color="BDD7EE" w:sz="1"/>
+              <w:bottom w:val="single" w:color="BDD7EE" w:sz="1"/>
+              <w:right w:val="single" w:color="BDD7EE" w:sz="1"/>
+            </w:tcBorders>
+            <w:shd w:fill="EBF3FB" w:val="clear"/>
+            <w:tcMar>
+              <w:top w:type="dxa" w:w="80"/>
+              <w:left w:type="dxa" w:w="150"/>
+              <w:bottom w:type="dxa" w:w="80"/>
+              <w:right w:type="dxa" w:w="150"/>
+            </w:tcMar>
+            <w:vAlign w:val="center"/>
+          </w:tcPr>
+          <w:p>
+            <w:pPr>
+              <w:jc w:val="left"/>
+            </w:pPr>
+            <w:r>
+              <w:rPr>
+                <w:rFonts w:ascii="Arial" w:cs="Arial" w:eastAsia="Arial" w:hAnsi="Arial"/>
+                <w:b w:val="false"/>
+                <w:bCs w:val="false"/>
+                <w:color w:val="000000"/>
+                <w:sz w:val="18"/>
+                <w:szCs w:val="18"/>
+              </w:rPr>
+              <w:t xml:space="preserve">Agentic RAG</w:t>
+            </w:r>
+          </w:p>
+        </w:tc>
+        <w:tc>
+          <w:tcPr>
+            <w:tcW w:type="dxa" w:w="1400"/>
+            <w:tcBorders>
+              <w:top w:val="single" w:color="BDD7EE" w:sz="1"/>
+              <w:left w:val="single" w:color="BDD7EE" w:sz="1"/>
+              <w:bottom w:val="single" w:color="BDD7EE" w:sz="1"/>
+              <w:right w:val="single" w:color="BDD7EE" w:sz="1"/>
+            </w:tcBorders>
+            <w:shd w:fill="EBF3FB" w:val="clear"/>
+            <w:tcMar>
+              <w:top w:type="dxa" w:w="80"/>
+              <w:left w:type="dxa" w:w="150"/>
+              <w:bottom w:type="dxa" w:w="80"/>
+              <w:right w:type="dxa" w:w="150"/>
+            </w:tcMar>
+            <w:vAlign w:val="center"/>
+          </w:tcPr>
+          <w:p>
+            <w:pPr>
+              <w:jc w:val="left"/>
+            </w:pPr>
+            <w:r>
+              <w:rPr>
+                <w:rFonts w:ascii="Arial" w:cs="Arial" w:eastAsia="Arial" w:hAnsi="Arial"/>
+                <w:b w:val="false"/>
+                <w:bCs w:val="false"/>
+                <w:color w:val="000000"/>
+                <w:sz w:val="18"/>
+                <w:szCs w:val="18"/>
+              </w:rPr>
+              <w:t xml:space="preserve">agentic_pipeline.py</w:t>
+            </w:r>
+          </w:p>
+        </w:tc>
+        <w:tc>
+          <w:tcPr>
+            <w:tcW w:type="dxa" w:w="800"/>
+            <w:tcBorders>
+              <w:top w:val="single" w:color="BDD7EE" w:sz="1"/>
+              <w:left w:val="single" w:color="BDD7EE" w:sz="1"/>
+              <w:bottom w:val="single" w:color="BDD7EE" w:sz="1"/>
+              <w:right w:val="single" w:color="BDD7EE" w:sz="1"/>
+            </w:tcBorders>
+            <w:shd w:fill="EBF3FB" w:val="clear"/>
+            <w:tcMar>
+              <w:top w:type="dxa" w:w="80"/>
+              <w:left w:type="dxa" w:w="150"/>
+              <w:bottom w:type="dxa" w:w="80"/>
+              <w:right w:type="dxa" w:w="150"/>
+            </w:tcMar>
+            <w:vAlign w:val="center"/>
+          </w:tcPr>
+          <w:p>
+            <w:pPr>
+              <w:jc w:val="left"/>
+            </w:pPr>
+            <w:r>
+              <w:rPr>
+                <w:rFonts w:ascii="Arial" w:cs="Arial" w:eastAsia="Arial" w:hAnsi="Arial"/>
+                <w:b w:val="false"/>
+                <w:bCs w:val="false"/>
+                <w:color w:val="000000"/>
+                <w:sz w:val="18"/>
+                <w:szCs w:val="18"/>
+              </w:rPr>
+              <w:t xml:space="preserve">100%</w:t>
+            </w:r>
+          </w:p>
+        </w:tc>
+        <w:tc>
+          <w:tcPr>
             <w:tcW w:type="dxa" w:w="2200"/>
             <w:tcBorders>
               <w:top w:val="single" w:color="BDD7EE" w:sz="1"/>
@@ -19427,112 +19988,42 @@
                 <w:sz w:val="18"/>
                 <w:szCs w:val="18"/>
               </w:rPr>
-              <w:t xml:space="preserve">Agentic RAG</w:t>
-            </w:r>
-          </w:p>
-        </w:tc>
-        <w:tc>
-          <w:tcPr>
-            <w:tcW w:type="dxa" w:w="2000"/>
-            <w:tcBorders>
-              <w:top w:val="single" w:color="BDD7EE" w:sz="1"/>
-              <w:left w:val="single" w:color="BDD7EE" w:sz="1"/>
-              <w:bottom w:val="single" w:color="BDD7EE" w:sz="1"/>
-              <w:right w:val="single" w:color="BDD7EE" w:sz="1"/>
-            </w:tcBorders>
-            <w:shd w:fill="EBF3FB" w:val="clear"/>
-            <w:tcMar>
-              <w:top w:type="dxa" w:w="80"/>
-              <w:left w:type="dxa" w:w="150"/>
-              <w:bottom w:type="dxa" w:w="80"/>
-              <w:right w:type="dxa" w:w="150"/>
-            </w:tcMar>
-            <w:vAlign w:val="center"/>
-          </w:tcPr>
-          <w:p>
-            <w:pPr>
-              <w:jc w:val="left"/>
-            </w:pPr>
-            <w:r>
-              <w:rPr>
-                <w:rFonts w:ascii="Arial" w:cs="Arial" w:eastAsia="Arial" w:hAnsi="Arial"/>
-                <w:b w:val="false"/>
-                <w:bCs w:val="false"/>
-                <w:color w:val="000000"/>
-                <w:sz w:val="18"/>
-                <w:szCs w:val="18"/>
-              </w:rPr>
-              <w:t xml:space="preserve">agentic_pipeline.py</w:t>
-            </w:r>
-          </w:p>
-        </w:tc>
-        <w:tc>
-          <w:tcPr>
-            <w:tcW w:type="dxa" w:w="2000"/>
-            <w:tcBorders>
-              <w:top w:val="single" w:color="BDD7EE" w:sz="1"/>
-              <w:left w:val="single" w:color="BDD7EE" w:sz="1"/>
-              <w:bottom w:val="single" w:color="BDD7EE" w:sz="1"/>
-              <w:right w:val="single" w:color="BDD7EE" w:sz="1"/>
-            </w:tcBorders>
-            <w:shd w:fill="EBF3FB" w:val="clear"/>
-            <w:tcMar>
-              <w:top w:type="dxa" w:w="80"/>
-              <w:left w:type="dxa" w:w="150"/>
-              <w:bottom w:type="dxa" w:w="80"/>
-              <w:right w:type="dxa" w:w="150"/>
-            </w:tcMar>
-            <w:vAlign w:val="center"/>
-          </w:tcPr>
-          <w:p>
-            <w:pPr>
-              <w:jc w:val="left"/>
-            </w:pPr>
-            <w:r>
-              <w:rPr>
-                <w:rFonts w:ascii="Arial" w:cs="Arial" w:eastAsia="Arial" w:hAnsi="Arial"/>
-                <w:b w:val="false"/>
-                <w:bCs w:val="false"/>
-                <w:color w:val="000000"/>
-                <w:sz w:val="18"/>
-                <w:szCs w:val="18"/>
-              </w:rPr>
-              <w:t xml:space="preserve">100%</w:t>
-            </w:r>
-          </w:p>
-        </w:tc>
-        <w:tc>
-          <w:tcPr>
-            <w:tcW w:type="dxa" w:w="2880"/>
-            <w:tcBorders>
-              <w:top w:val="single" w:color="BDD7EE" w:sz="1"/>
-              <w:left w:val="single" w:color="BDD7EE" w:sz="1"/>
-              <w:bottom w:val="single" w:color="BDD7EE" w:sz="1"/>
-              <w:right w:val="single" w:color="BDD7EE" w:sz="1"/>
-            </w:tcBorders>
-            <w:shd w:fill="EBF3FB" w:val="clear"/>
-            <w:tcMar>
-              <w:top w:type="dxa" w:w="80"/>
-              <w:left w:type="dxa" w:w="150"/>
-              <w:bottom w:type="dxa" w:w="80"/>
-              <w:right w:type="dxa" w:w="150"/>
-            </w:tcMar>
-            <w:vAlign w:val="center"/>
-          </w:tcPr>
-          <w:p>
-            <w:pPr>
-              <w:jc w:val="left"/>
-            </w:pPr>
-            <w:r>
-              <w:rPr>
-                <w:rFonts w:ascii="Arial" w:cs="Arial" w:eastAsia="Arial" w:hAnsi="Arial"/>
-                <w:b w:val="false"/>
-                <w:bCs w:val="false"/>
-                <w:color w:val="000000"/>
-                <w:sz w:val="18"/>
-                <w:szCs w:val="18"/>
-              </w:rPr>
-              <w:t xml:space="preserve">Agent rephrases query: 'deglazing fond'. Avg 1.6 calls/q.</w:t>
+              <w:t xml:space="preserve">Instead of us writing the search query, Claude writes it. Claude is given a search tool and decides what words to use. It can also search multiple times — refining its query until it finds the right information.</w:t>
+            </w:r>
+          </w:p>
+        </w:tc>
+        <w:tc>
+          <w:tcPr>
+            <w:tcW w:type="dxa" w:w="2180"/>
+            <w:tcBorders>
+              <w:top w:val="single" w:color="BDD7EE" w:sz="1"/>
+              <w:left w:val="single" w:color="BDD7EE" w:sz="1"/>
+              <w:bottom w:val="single" w:color="BDD7EE" w:sz="1"/>
+              <w:right w:val="single" w:color="BDD7EE" w:sz="1"/>
+            </w:tcBorders>
+            <w:shd w:fill="EBF3FB" w:val="clear"/>
+            <w:tcMar>
+              <w:top w:type="dxa" w:w="80"/>
+              <w:left w:type="dxa" w:w="150"/>
+              <w:bottom w:type="dxa" w:w="80"/>
+              <w:right w:type="dxa" w:w="150"/>
+            </w:tcMar>
+            <w:vAlign w:val="center"/>
+          </w:tcPr>
+          <w:p>
+            <w:pPr>
+              <w:jc w:val="left"/>
+            </w:pPr>
+            <w:r>
+              <w:rPr>
+                <w:rFonts w:ascii="Arial" w:cs="Arial" w:eastAsia="Arial" w:hAnsi="Arial"/>
+                <w:b w:val="false"/>
+                <w:bCs w:val="false"/>
+                <w:color w:val="000000"/>
+                <w:sz w:val="18"/>
+                <w:szCs w:val="18"/>
+              </w:rPr>
+              <w:t xml:space="preserve">Claude rephrased Q9 as 'deglazing fond' (document language) instead of 'pan sauce' (user language). It fixed its own vocabulary mismatch.</w:t>
             </w:r>
           </w:p>
         </w:tc>
@@ -19540,7 +20031,7 @@
       <w:tr>
         <w:tc>
           <w:tcPr>
-            <w:tcW w:type="dxa" w:w="1000"/>
+            <w:tcW w:type="dxa" w:w="600"/>
             <w:tcBorders>
               <w:top w:val="single" w:color="BDD7EE" w:sz="1"/>
               <w:left w:val="single" w:color="BDD7EE" w:sz="1"/>
@@ -19575,6 +20066,146 @@
         </w:tc>
         <w:tc>
           <w:tcPr>
+            <w:tcW w:type="dxa" w:w="1400"/>
+            <w:tcBorders>
+              <w:top w:val="single" w:color="BDD7EE" w:sz="1"/>
+              <w:left w:val="single" w:color="BDD7EE" w:sz="1"/>
+              <w:bottom w:val="single" w:color="BDD7EE" w:sz="1"/>
+              <w:right w:val="single" w:color="BDD7EE" w:sz="1"/>
+            </w:tcBorders>
+            <w:shd w:fill="FFFFFF" w:val="clear"/>
+            <w:tcMar>
+              <w:top w:type="dxa" w:w="80"/>
+              <w:left w:type="dxa" w:w="150"/>
+              <w:bottom w:type="dxa" w:w="80"/>
+              <w:right w:type="dxa" w:w="150"/>
+            </w:tcMar>
+            <w:vAlign w:val="center"/>
+          </w:tcPr>
+          <w:p>
+            <w:pPr>
+              <w:jc w:val="left"/>
+            </w:pPr>
+            <w:r>
+              <w:rPr>
+                <w:rFonts w:ascii="Arial" w:cs="Arial" w:eastAsia="Arial" w:hAnsi="Arial"/>
+                <w:b w:val="false"/>
+                <w:bCs w:val="false"/>
+                <w:color w:val="000000"/>
+                <w:sz w:val="18"/>
+                <w:szCs w:val="18"/>
+              </w:rPr>
+              <w:t xml:space="preserve">6a — BGE-large</w:t>
+            </w:r>
+          </w:p>
+        </w:tc>
+        <w:tc>
+          <w:tcPr>
+            <w:tcW w:type="dxa" w:w="1500"/>
+            <w:tcBorders>
+              <w:top w:val="single" w:color="BDD7EE" w:sz="1"/>
+              <w:left w:val="single" w:color="BDD7EE" w:sz="1"/>
+              <w:bottom w:val="single" w:color="BDD7EE" w:sz="1"/>
+              <w:right w:val="single" w:color="BDD7EE" w:sz="1"/>
+            </w:tcBorders>
+            <w:shd w:fill="FFFFFF" w:val="clear"/>
+            <w:tcMar>
+              <w:top w:type="dxa" w:w="80"/>
+              <w:left w:type="dxa" w:w="150"/>
+              <w:bottom w:type="dxa" w:w="80"/>
+              <w:right w:type="dxa" w:w="150"/>
+            </w:tcMar>
+            <w:vAlign w:val="center"/>
+          </w:tcPr>
+          <w:p>
+            <w:pPr>
+              <w:jc w:val="left"/>
+            </w:pPr>
+            <w:r>
+              <w:rPr>
+                <w:rFonts w:ascii="Arial" w:cs="Arial" w:eastAsia="Arial" w:hAnsi="Arial"/>
+                <w:b w:val="false"/>
+                <w:bCs w:val="false"/>
+                <w:color w:val="000000"/>
+                <w:sz w:val="18"/>
+                <w:szCs w:val="18"/>
+              </w:rPr>
+              <w:t xml:space="preserve">Graph RAG</w:t>
+            </w:r>
+          </w:p>
+        </w:tc>
+        <w:tc>
+          <w:tcPr>
+            <w:tcW w:type="dxa" w:w="1400"/>
+            <w:tcBorders>
+              <w:top w:val="single" w:color="BDD7EE" w:sz="1"/>
+              <w:left w:val="single" w:color="BDD7EE" w:sz="1"/>
+              <w:bottom w:val="single" w:color="BDD7EE" w:sz="1"/>
+              <w:right w:val="single" w:color="BDD7EE" w:sz="1"/>
+            </w:tcBorders>
+            <w:shd w:fill="FFFFFF" w:val="clear"/>
+            <w:tcMar>
+              <w:top w:type="dxa" w:w="80"/>
+              <w:left w:type="dxa" w:w="150"/>
+              <w:bottom w:type="dxa" w:w="80"/>
+              <w:right w:type="dxa" w:w="150"/>
+            </w:tcMar>
+            <w:vAlign w:val="center"/>
+          </w:tcPr>
+          <w:p>
+            <w:pPr>
+              <w:jc w:val="left"/>
+            </w:pPr>
+            <w:r>
+              <w:rPr>
+                <w:rFonts w:ascii="Arial" w:cs="Arial" w:eastAsia="Arial" w:hAnsi="Arial"/>
+                <w:b w:val="false"/>
+                <w:bCs w:val="false"/>
+                <w:color w:val="000000"/>
+                <w:sz w:val="18"/>
+                <w:szCs w:val="18"/>
+              </w:rPr>
+              <w:t xml:space="preserve">graph_pipeline.py</w:t>
+            </w:r>
+          </w:p>
+        </w:tc>
+        <w:tc>
+          <w:tcPr>
+            <w:tcW w:type="dxa" w:w="800"/>
+            <w:tcBorders>
+              <w:top w:val="single" w:color="BDD7EE" w:sz="1"/>
+              <w:left w:val="single" w:color="BDD7EE" w:sz="1"/>
+              <w:bottom w:val="single" w:color="BDD7EE" w:sz="1"/>
+              <w:right w:val="single" w:color="BDD7EE" w:sz="1"/>
+            </w:tcBorders>
+            <w:shd w:fill="FFFFFF" w:val="clear"/>
+            <w:tcMar>
+              <w:top w:type="dxa" w:w="80"/>
+              <w:left w:type="dxa" w:w="150"/>
+              <w:bottom w:type="dxa" w:w="80"/>
+              <w:right w:type="dxa" w:w="150"/>
+            </w:tcMar>
+            <w:vAlign w:val="center"/>
+          </w:tcPr>
+          <w:p>
+            <w:pPr>
+              <w:jc w:val="left"/>
+            </w:pPr>
+            <w:r>
+              <w:rPr>
+                <w:rFonts w:ascii="Arial" w:cs="Arial" w:eastAsia="Arial" w:hAnsi="Arial"/>
+                <w:b w:val="false"/>
+                <w:bCs w:val="false"/>
+                <w:color w:val="000000"/>
+                <w:sz w:val="18"/>
+                <w:szCs w:val="18"/>
+              </w:rPr>
+              <w:t xml:space="preserve">75%</w:t>
+            </w:r>
+          </w:p>
+        </w:tc>
+        <w:tc>
+          <w:tcPr>
             <w:tcW w:type="dxa" w:w="2200"/>
             <w:tcBorders>
               <w:top w:val="single" w:color="BDD7EE" w:sz="1"/>
@@ -19604,112 +20235,42 @@
                 <w:sz w:val="18"/>
                 <w:szCs w:val="18"/>
               </w:rPr>
-              <w:t xml:space="preserve">Graph RAG</w:t>
-            </w:r>
-          </w:p>
-        </w:tc>
-        <w:tc>
-          <w:tcPr>
-            <w:tcW w:type="dxa" w:w="2000"/>
-            <w:tcBorders>
-              <w:top w:val="single" w:color="BDD7EE" w:sz="1"/>
-              <w:left w:val="single" w:color="BDD7EE" w:sz="1"/>
-              <w:bottom w:val="single" w:color="BDD7EE" w:sz="1"/>
-              <w:right w:val="single" w:color="BDD7EE" w:sz="1"/>
-            </w:tcBorders>
-            <w:shd w:fill="FFFFFF" w:val="clear"/>
-            <w:tcMar>
-              <w:top w:type="dxa" w:w="80"/>
-              <w:left w:type="dxa" w:w="150"/>
-              <w:bottom w:type="dxa" w:w="80"/>
-              <w:right w:type="dxa" w:w="150"/>
-            </w:tcMar>
-            <w:vAlign w:val="center"/>
-          </w:tcPr>
-          <w:p>
-            <w:pPr>
-              <w:jc w:val="left"/>
-            </w:pPr>
-            <w:r>
-              <w:rPr>
-                <w:rFonts w:ascii="Arial" w:cs="Arial" w:eastAsia="Arial" w:hAnsi="Arial"/>
-                <w:b w:val="false"/>
-                <w:bCs w:val="false"/>
-                <w:color w:val="000000"/>
-                <w:sz w:val="18"/>
-                <w:szCs w:val="18"/>
-              </w:rPr>
-              <w:t xml:space="preserve">graph_pipeline.py</w:t>
-            </w:r>
-          </w:p>
-        </w:tc>
-        <w:tc>
-          <w:tcPr>
-            <w:tcW w:type="dxa" w:w="2000"/>
-            <w:tcBorders>
-              <w:top w:val="single" w:color="BDD7EE" w:sz="1"/>
-              <w:left w:val="single" w:color="BDD7EE" w:sz="1"/>
-              <w:bottom w:val="single" w:color="BDD7EE" w:sz="1"/>
-              <w:right w:val="single" w:color="BDD7EE" w:sz="1"/>
-            </w:tcBorders>
-            <w:shd w:fill="FFFFFF" w:val="clear"/>
-            <w:tcMar>
-              <w:top w:type="dxa" w:w="80"/>
-              <w:left w:type="dxa" w:w="150"/>
-              <w:bottom w:type="dxa" w:w="80"/>
-              <w:right w:type="dxa" w:w="150"/>
-            </w:tcMar>
-            <w:vAlign w:val="center"/>
-          </w:tcPr>
-          <w:p>
-            <w:pPr>
-              <w:jc w:val="left"/>
-            </w:pPr>
-            <w:r>
-              <w:rPr>
-                <w:rFonts w:ascii="Arial" w:cs="Arial" w:eastAsia="Arial" w:hAnsi="Arial"/>
-                <w:b w:val="false"/>
-                <w:bCs w:val="false"/>
-                <w:color w:val="000000"/>
-                <w:sz w:val="18"/>
-                <w:szCs w:val="18"/>
-              </w:rPr>
-              <w:t xml:space="preserve">75%</w:t>
-            </w:r>
-          </w:p>
-        </w:tc>
-        <w:tc>
-          <w:tcPr>
-            <w:tcW w:type="dxa" w:w="2880"/>
-            <w:tcBorders>
-              <w:top w:val="single" w:color="BDD7EE" w:sz="1"/>
-              <w:left w:val="single" w:color="BDD7EE" w:sz="1"/>
-              <w:bottom w:val="single" w:color="BDD7EE" w:sz="1"/>
-              <w:right w:val="single" w:color="BDD7EE" w:sz="1"/>
-            </w:tcBorders>
-            <w:shd w:fill="FFFFFF" w:val="clear"/>
-            <w:tcMar>
-              <w:top w:type="dxa" w:w="80"/>
-              <w:left w:type="dxa" w:w="150"/>
-              <w:bottom w:type="dxa" w:w="80"/>
-              <w:right w:type="dxa" w:w="150"/>
-            </w:tcMar>
-            <w:vAlign w:val="center"/>
-          </w:tcPr>
-          <w:p>
-            <w:pPr>
-              <w:jc w:val="left"/>
-            </w:pPr>
-            <w:r>
-              <w:rPr>
-                <w:rFonts w:ascii="Arial" w:cs="Arial" w:eastAsia="Arial" w:hAnsi="Arial"/>
-                <w:b w:val="false"/>
-                <w:bCs w:val="false"/>
-                <w:color w:val="000000"/>
-                <w:sz w:val="18"/>
-                <w:szCs w:val="18"/>
-              </w:rPr>
-              <w:t xml:space="preserve">-20%. Entry node failure cascades — wrong start, wrong expansion.</w:t>
+              <w:t xml:space="preserve">We built a map of how all 20 documents connect (which topics share concepts). When a question arrives, we find the closest document, then follow the connections to pull in related documents too.</w:t>
+            </w:r>
+          </w:p>
+        </w:tc>
+        <w:tc>
+          <w:tcPr>
+            <w:tcW w:type="dxa" w:w="2180"/>
+            <w:tcBorders>
+              <w:top w:val="single" w:color="BDD7EE" w:sz="1"/>
+              <w:left w:val="single" w:color="BDD7EE" w:sz="1"/>
+              <w:bottom w:val="single" w:color="BDD7EE" w:sz="1"/>
+              <w:right w:val="single" w:color="BDD7EE" w:sz="1"/>
+            </w:tcBorders>
+            <w:shd w:fill="FFFFFF" w:val="clear"/>
+            <w:tcMar>
+              <w:top w:type="dxa" w:w="80"/>
+              <w:left w:type="dxa" w:w="150"/>
+              <w:bottom w:type="dxa" w:w="80"/>
+              <w:right w:type="dxa" w:w="150"/>
+            </w:tcMar>
+            <w:vAlign w:val="center"/>
+          </w:tcPr>
+          <w:p>
+            <w:pPr>
+              <w:jc w:val="left"/>
+            </w:pPr>
+            <w:r>
+              <w:rPr>
+                <w:rFonts w:ascii="Arial" w:cs="Arial" w:eastAsia="Arial" w:hAnsi="Arial"/>
+                <w:b w:val="false"/>
+                <w:bCs w:val="false"/>
+                <w:color w:val="000000"/>
+                <w:sz w:val="18"/>
+                <w:szCs w:val="18"/>
+              </w:rPr>
+              <w:t xml:space="preserve">-20%. If the first document is wrong, following its connections makes things worse — the error compounds.</w:t>
             </w:r>
           </w:p>
         </w:tc>
@@ -19717,7 +20278,7 @@
       <w:tr>
         <w:tc>
           <w:tcPr>
-            <w:tcW w:type="dxa" w:w="1000"/>
+            <w:tcW w:type="dxa" w:w="600"/>
             <w:tcBorders>
               <w:top w:val="single" w:color="BDD7EE" w:sz="1"/>
               <w:left w:val="single" w:color="BDD7EE" w:sz="1"/>
@@ -19752,6 +20313,146 @@
         </w:tc>
         <w:tc>
           <w:tcPr>
+            <w:tcW w:type="dxa" w:w="1400"/>
+            <w:tcBorders>
+              <w:top w:val="single" w:color="BDD7EE" w:sz="1"/>
+              <w:left w:val="single" w:color="BDD7EE" w:sz="1"/>
+              <w:bottom w:val="single" w:color="BDD7EE" w:sz="1"/>
+              <w:right w:val="single" w:color="BDD7EE" w:sz="1"/>
+            </w:tcBorders>
+            <w:shd w:fill="EBF3FB" w:val="clear"/>
+            <w:tcMar>
+              <w:top w:type="dxa" w:w="80"/>
+              <w:left w:type="dxa" w:w="150"/>
+              <w:bottom w:type="dxa" w:w="80"/>
+              <w:right w:type="dxa" w:w="150"/>
+            </w:tcMar>
+            <w:vAlign w:val="center"/>
+          </w:tcPr>
+          <w:p>
+            <w:pPr>
+              <w:jc w:val="left"/>
+            </w:pPr>
+            <w:r>
+              <w:rPr>
+                <w:rFonts w:ascii="Arial" w:cs="Arial" w:eastAsia="Arial" w:hAnsi="Arial"/>
+                <w:b w:val="false"/>
+                <w:bCs w:val="false"/>
+                <w:color w:val="000000"/>
+                <w:sz w:val="18"/>
+                <w:szCs w:val="18"/>
+              </w:rPr>
+              <w:t xml:space="preserve">6a — BGE-large</w:t>
+            </w:r>
+          </w:p>
+        </w:tc>
+        <w:tc>
+          <w:tcPr>
+            <w:tcW w:type="dxa" w:w="1500"/>
+            <w:tcBorders>
+              <w:top w:val="single" w:color="BDD7EE" w:sz="1"/>
+              <w:left w:val="single" w:color="BDD7EE" w:sz="1"/>
+              <w:bottom w:val="single" w:color="BDD7EE" w:sz="1"/>
+              <w:right w:val="single" w:color="BDD7EE" w:sz="1"/>
+            </w:tcBorders>
+            <w:shd w:fill="EBF3FB" w:val="clear"/>
+            <w:tcMar>
+              <w:top w:type="dxa" w:w="80"/>
+              <w:left w:type="dxa" w:w="150"/>
+              <w:bottom w:type="dxa" w:w="80"/>
+              <w:right w:type="dxa" w:w="150"/>
+            </w:tcMar>
+            <w:vAlign w:val="center"/>
+          </w:tcPr>
+          <w:p>
+            <w:pPr>
+              <w:jc w:val="left"/>
+            </w:pPr>
+            <w:r>
+              <w:rPr>
+                <w:rFonts w:ascii="Arial" w:cs="Arial" w:eastAsia="Arial" w:hAnsi="Arial"/>
+                <w:b w:val="false"/>
+                <w:bCs w:val="false"/>
+                <w:color w:val="000000"/>
+                <w:sz w:val="18"/>
+                <w:szCs w:val="18"/>
+              </w:rPr>
+              <w:t xml:space="preserve">LangChain LCEL</w:t>
+            </w:r>
+          </w:p>
+        </w:tc>
+        <w:tc>
+          <w:tcPr>
+            <w:tcW w:type="dxa" w:w="1400"/>
+            <w:tcBorders>
+              <w:top w:val="single" w:color="BDD7EE" w:sz="1"/>
+              <w:left w:val="single" w:color="BDD7EE" w:sz="1"/>
+              <w:bottom w:val="single" w:color="BDD7EE" w:sz="1"/>
+              <w:right w:val="single" w:color="BDD7EE" w:sz="1"/>
+            </w:tcBorders>
+            <w:shd w:fill="EBF3FB" w:val="clear"/>
+            <w:tcMar>
+              <w:top w:type="dxa" w:w="80"/>
+              <w:left w:type="dxa" w:w="150"/>
+              <w:bottom w:type="dxa" w:w="80"/>
+              <w:right w:type="dxa" w:w="150"/>
+            </w:tcMar>
+            <w:vAlign w:val="center"/>
+          </w:tcPr>
+          <w:p>
+            <w:pPr>
+              <w:jc w:val="left"/>
+            </w:pPr>
+            <w:r>
+              <w:rPr>
+                <w:rFonts w:ascii="Arial" w:cs="Arial" w:eastAsia="Arial" w:hAnsi="Arial"/>
+                <w:b w:val="false"/>
+                <w:bCs w:val="false"/>
+                <w:color w:val="000000"/>
+                <w:sz w:val="18"/>
+                <w:szCs w:val="18"/>
+              </w:rPr>
+              <w:t xml:space="preserve">langchain_pipeline.py</w:t>
+            </w:r>
+          </w:p>
+        </w:tc>
+        <w:tc>
+          <w:tcPr>
+            <w:tcW w:type="dxa" w:w="800"/>
+            <w:tcBorders>
+              <w:top w:val="single" w:color="BDD7EE" w:sz="1"/>
+              <w:left w:val="single" w:color="BDD7EE" w:sz="1"/>
+              <w:bottom w:val="single" w:color="BDD7EE" w:sz="1"/>
+              <w:right w:val="single" w:color="BDD7EE" w:sz="1"/>
+            </w:tcBorders>
+            <w:shd w:fill="EBF3FB" w:val="clear"/>
+            <w:tcMar>
+              <w:top w:type="dxa" w:w="80"/>
+              <w:left w:type="dxa" w:w="150"/>
+              <w:bottom w:type="dxa" w:w="80"/>
+              <w:right w:type="dxa" w:w="150"/>
+            </w:tcMar>
+            <w:vAlign w:val="center"/>
+          </w:tcPr>
+          <w:p>
+            <w:pPr>
+              <w:jc w:val="left"/>
+            </w:pPr>
+            <w:r>
+              <w:rPr>
+                <w:rFonts w:ascii="Arial" w:cs="Arial" w:eastAsia="Arial" w:hAnsi="Arial"/>
+                <w:b w:val="false"/>
+                <w:bCs w:val="false"/>
+                <w:color w:val="000000"/>
+                <w:sz w:val="18"/>
+                <w:szCs w:val="18"/>
+              </w:rPr>
+              <w:t xml:space="preserve">95%</w:t>
+            </w:r>
+          </w:p>
+        </w:tc>
+        <w:tc>
+          <w:tcPr>
             <w:tcW w:type="dxa" w:w="2200"/>
             <w:tcBorders>
               <w:top w:val="single" w:color="BDD7EE" w:sz="1"/>
@@ -19781,112 +20482,42 @@
                 <w:sz w:val="18"/>
                 <w:szCs w:val="18"/>
               </w:rPr>
-              <w:t xml:space="preserve">LangChain LCEL</w:t>
-            </w:r>
-          </w:p>
-        </w:tc>
-        <w:tc>
-          <w:tcPr>
-            <w:tcW w:type="dxa" w:w="2000"/>
-            <w:tcBorders>
-              <w:top w:val="single" w:color="BDD7EE" w:sz="1"/>
-              <w:left w:val="single" w:color="BDD7EE" w:sz="1"/>
-              <w:bottom w:val="single" w:color="BDD7EE" w:sz="1"/>
-              <w:right w:val="single" w:color="BDD7EE" w:sz="1"/>
-            </w:tcBorders>
-            <w:shd w:fill="EBF3FB" w:val="clear"/>
-            <w:tcMar>
-              <w:top w:type="dxa" w:w="80"/>
-              <w:left w:type="dxa" w:w="150"/>
-              <w:bottom w:type="dxa" w:w="80"/>
-              <w:right w:type="dxa" w:w="150"/>
-            </w:tcMar>
-            <w:vAlign w:val="center"/>
-          </w:tcPr>
-          <w:p>
-            <w:pPr>
-              <w:jc w:val="left"/>
-            </w:pPr>
-            <w:r>
-              <w:rPr>
-                <w:rFonts w:ascii="Arial" w:cs="Arial" w:eastAsia="Arial" w:hAnsi="Arial"/>
-                <w:b w:val="false"/>
-                <w:bCs w:val="false"/>
-                <w:color w:val="000000"/>
-                <w:sz w:val="18"/>
-                <w:szCs w:val="18"/>
-              </w:rPr>
-              <w:t xml:space="preserve">langchain_pipeline.py</w:t>
-            </w:r>
-          </w:p>
-        </w:tc>
-        <w:tc>
-          <w:tcPr>
-            <w:tcW w:type="dxa" w:w="2000"/>
-            <w:tcBorders>
-              <w:top w:val="single" w:color="BDD7EE" w:sz="1"/>
-              <w:left w:val="single" w:color="BDD7EE" w:sz="1"/>
-              <w:bottom w:val="single" w:color="BDD7EE" w:sz="1"/>
-              <w:right w:val="single" w:color="BDD7EE" w:sz="1"/>
-            </w:tcBorders>
-            <w:shd w:fill="EBF3FB" w:val="clear"/>
-            <w:tcMar>
-              <w:top w:type="dxa" w:w="80"/>
-              <w:left w:type="dxa" w:w="150"/>
-              <w:bottom w:type="dxa" w:w="80"/>
-              <w:right w:type="dxa" w:w="150"/>
-            </w:tcMar>
-            <w:vAlign w:val="center"/>
-          </w:tcPr>
-          <w:p>
-            <w:pPr>
-              <w:jc w:val="left"/>
-            </w:pPr>
-            <w:r>
-              <w:rPr>
-                <w:rFonts w:ascii="Arial" w:cs="Arial" w:eastAsia="Arial" w:hAnsi="Arial"/>
-                <w:b w:val="false"/>
-                <w:bCs w:val="false"/>
-                <w:color w:val="000000"/>
-                <w:sz w:val="18"/>
-                <w:szCs w:val="18"/>
-              </w:rPr>
-              <w:t xml:space="preserve">95%</w:t>
-            </w:r>
-          </w:p>
-        </w:tc>
-        <w:tc>
-          <w:tcPr>
-            <w:tcW w:type="dxa" w:w="2880"/>
-            <w:tcBorders>
-              <w:top w:val="single" w:color="BDD7EE" w:sz="1"/>
-              <w:left w:val="single" w:color="BDD7EE" w:sz="1"/>
-              <w:bottom w:val="single" w:color="BDD7EE" w:sz="1"/>
-              <w:right w:val="single" w:color="BDD7EE" w:sz="1"/>
-            </w:tcBorders>
-            <w:shd w:fill="EBF3FB" w:val="clear"/>
-            <w:tcMar>
-              <w:top w:type="dxa" w:w="80"/>
-              <w:left w:type="dxa" w:w="150"/>
-              <w:bottom w:type="dxa" w:w="80"/>
-              <w:right w:type="dxa" w:w="150"/>
-            </w:tcMar>
-            <w:vAlign w:val="center"/>
-          </w:tcPr>
-          <w:p>
-            <w:pPr>
-              <w:jc w:val="left"/>
-            </w:pPr>
-            <w:r>
-              <w:rPr>
-                <w:rFonts w:ascii="Arial" w:cs="Arial" w:eastAsia="Arial" w:hAnsi="Arial"/>
-                <w:b w:val="false"/>
-                <w:bCs w:val="false"/>
-                <w:color w:val="000000"/>
-                <w:sz w:val="18"/>
-                <w:szCs w:val="18"/>
-              </w:rPr>
-              <w:t xml:space="preserve">Framework parity. LCEL pipe: retriever | prompt | llm | parser.</w:t>
+              <w:t xml:space="preserve">We rebuilt the same BGE-large pipeline using LangChain — a popular framework with ready-made building blocks. The logic is identical; only the code style changes.</w:t>
+            </w:r>
+          </w:p>
+        </w:tc>
+        <w:tc>
+          <w:tcPr>
+            <w:tcW w:type="dxa" w:w="2180"/>
+            <w:tcBorders>
+              <w:top w:val="single" w:color="BDD7EE" w:sz="1"/>
+              <w:left w:val="single" w:color="BDD7EE" w:sz="1"/>
+              <w:bottom w:val="single" w:color="BDD7EE" w:sz="1"/>
+              <w:right w:val="single" w:color="BDD7EE" w:sz="1"/>
+            </w:tcBorders>
+            <w:shd w:fill="EBF3FB" w:val="clear"/>
+            <w:tcMar>
+              <w:top w:type="dxa" w:w="80"/>
+              <w:left w:type="dxa" w:w="150"/>
+              <w:bottom w:type="dxa" w:w="80"/>
+              <w:right w:type="dxa" w:w="150"/>
+            </w:tcMar>
+            <w:vAlign w:val="center"/>
+          </w:tcPr>
+          <w:p>
+            <w:pPr>
+              <w:jc w:val="left"/>
+            </w:pPr>
+            <w:r>
+              <w:rPr>
+                <w:rFonts w:ascii="Arial" w:cs="Arial" w:eastAsia="Arial" w:hAnsi="Arial"/>
+                <w:b w:val="false"/>
+                <w:bCs w:val="false"/>
+                <w:color w:val="000000"/>
+                <w:sz w:val="18"/>
+                <w:szCs w:val="18"/>
+              </w:rPr>
+              <w:t xml:space="preserve">Framework = wrapper around the same concepts. Accuracy matches the manual BGE-large pipeline (Step 6a).</w:t>
             </w:r>
           </w:p>
         </w:tc>
@@ -19894,7 +20525,7 @@
       <w:tr>
         <w:tc>
           <w:tcPr>
-            <w:tcW w:type="dxa" w:w="1000"/>
+            <w:tcW w:type="dxa" w:w="600"/>
             <w:tcBorders>
               <w:top w:val="single" w:color="BDD7EE" w:sz="1"/>
               <w:left w:val="single" w:color="BDD7EE" w:sz="1"/>
@@ -19929,6 +20560,146 @@
         </w:tc>
         <w:tc>
           <w:tcPr>
+            <w:tcW w:type="dxa" w:w="1400"/>
+            <w:tcBorders>
+              <w:top w:val="single" w:color="BDD7EE" w:sz="1"/>
+              <w:left w:val="single" w:color="BDD7EE" w:sz="1"/>
+              <w:bottom w:val="single" w:color="BDD7EE" w:sz="1"/>
+              <w:right w:val="single" w:color="BDD7EE" w:sz="1"/>
+            </w:tcBorders>
+            <w:shd w:fill="FFFFFF" w:val="clear"/>
+            <w:tcMar>
+              <w:top w:type="dxa" w:w="80"/>
+              <w:left w:type="dxa" w:w="150"/>
+              <w:bottom w:type="dxa" w:w="80"/>
+              <w:right w:type="dxa" w:w="150"/>
+            </w:tcMar>
+            <w:vAlign w:val="center"/>
+          </w:tcPr>
+          <w:p>
+            <w:pPr>
+              <w:jc w:val="left"/>
+            </w:pPr>
+            <w:r>
+              <w:rPr>
+                <w:rFonts w:ascii="Arial" w:cs="Arial" w:eastAsia="Arial" w:hAnsi="Arial"/>
+                <w:b w:val="false"/>
+                <w:bCs w:val="false"/>
+                <w:color w:val="000000"/>
+                <w:sz w:val="18"/>
+                <w:szCs w:val="18"/>
+              </w:rPr>
+              <w:t xml:space="preserve">7 — LangChain</w:t>
+            </w:r>
+          </w:p>
+        </w:tc>
+        <w:tc>
+          <w:tcPr>
+            <w:tcW w:type="dxa" w:w="1500"/>
+            <w:tcBorders>
+              <w:top w:val="single" w:color="BDD7EE" w:sz="1"/>
+              <w:left w:val="single" w:color="BDD7EE" w:sz="1"/>
+              <w:bottom w:val="single" w:color="BDD7EE" w:sz="1"/>
+              <w:right w:val="single" w:color="BDD7EE" w:sz="1"/>
+            </w:tcBorders>
+            <w:shd w:fill="FFFFFF" w:val="clear"/>
+            <w:tcMar>
+              <w:top w:type="dxa" w:w="80"/>
+              <w:left w:type="dxa" w:w="150"/>
+              <w:bottom w:type="dxa" w:w="80"/>
+              <w:right w:type="dxa" w:w="150"/>
+            </w:tcMar>
+            <w:vAlign w:val="center"/>
+          </w:tcPr>
+          <w:p>
+            <w:pPr>
+              <w:jc w:val="left"/>
+            </w:pPr>
+            <w:r>
+              <w:rPr>
+                <w:rFonts w:ascii="Arial" w:cs="Arial" w:eastAsia="Arial" w:hAnsi="Arial"/>
+                <w:b w:val="false"/>
+                <w:bCs w:val="false"/>
+                <w:color w:val="000000"/>
+                <w:sz w:val="18"/>
+                <w:szCs w:val="18"/>
+              </w:rPr>
+              <w:t xml:space="preserve">LlamaIndex</w:t>
+            </w:r>
+          </w:p>
+        </w:tc>
+        <w:tc>
+          <w:tcPr>
+            <w:tcW w:type="dxa" w:w="1400"/>
+            <w:tcBorders>
+              <w:top w:val="single" w:color="BDD7EE" w:sz="1"/>
+              <w:left w:val="single" w:color="BDD7EE" w:sz="1"/>
+              <w:bottom w:val="single" w:color="BDD7EE" w:sz="1"/>
+              <w:right w:val="single" w:color="BDD7EE" w:sz="1"/>
+            </w:tcBorders>
+            <w:shd w:fill="FFFFFF" w:val="clear"/>
+            <w:tcMar>
+              <w:top w:type="dxa" w:w="80"/>
+              <w:left w:type="dxa" w:w="150"/>
+              <w:bottom w:type="dxa" w:w="80"/>
+              <w:right w:type="dxa" w:w="150"/>
+            </w:tcMar>
+            <w:vAlign w:val="center"/>
+          </w:tcPr>
+          <w:p>
+            <w:pPr>
+              <w:jc w:val="left"/>
+            </w:pPr>
+            <w:r>
+              <w:rPr>
+                <w:rFonts w:ascii="Arial" w:cs="Arial" w:eastAsia="Arial" w:hAnsi="Arial"/>
+                <w:b w:val="false"/>
+                <w:bCs w:val="false"/>
+                <w:color w:val="000000"/>
+                <w:sz w:val="18"/>
+                <w:szCs w:val="18"/>
+              </w:rPr>
+              <w:t xml:space="preserve">llamaindex_pipeline.py</w:t>
+            </w:r>
+          </w:p>
+        </w:tc>
+        <w:tc>
+          <w:tcPr>
+            <w:tcW w:type="dxa" w:w="800"/>
+            <w:tcBorders>
+              <w:top w:val="single" w:color="BDD7EE" w:sz="1"/>
+              <w:left w:val="single" w:color="BDD7EE" w:sz="1"/>
+              <w:bottom w:val="single" w:color="BDD7EE" w:sz="1"/>
+              <w:right w:val="single" w:color="BDD7EE" w:sz="1"/>
+            </w:tcBorders>
+            <w:shd w:fill="FFFFFF" w:val="clear"/>
+            <w:tcMar>
+              <w:top w:type="dxa" w:w="80"/>
+              <w:left w:type="dxa" w:w="150"/>
+              <w:bottom w:type="dxa" w:w="80"/>
+              <w:right w:type="dxa" w:w="150"/>
+            </w:tcMar>
+            <w:vAlign w:val="center"/>
+          </w:tcPr>
+          <w:p>
+            <w:pPr>
+              <w:jc w:val="left"/>
+            </w:pPr>
+            <w:r>
+              <w:rPr>
+                <w:rFonts w:ascii="Arial" w:cs="Arial" w:eastAsia="Arial" w:hAnsi="Arial"/>
+                <w:b w:val="false"/>
+                <w:bCs w:val="false"/>
+                <w:color w:val="000000"/>
+                <w:sz w:val="18"/>
+                <w:szCs w:val="18"/>
+              </w:rPr>
+              <w:t xml:space="preserve">100%</w:t>
+            </w:r>
+          </w:p>
+        </w:tc>
+        <w:tc>
+          <w:tcPr>
             <w:tcW w:type="dxa" w:w="2200"/>
             <w:tcBorders>
               <w:top w:val="single" w:color="BDD7EE" w:sz="1"/>
@@ -19958,112 +20729,42 @@
                 <w:sz w:val="18"/>
                 <w:szCs w:val="18"/>
               </w:rPr>
-              <w:t xml:space="preserve">LlamaIndex</w:t>
-            </w:r>
-          </w:p>
-        </w:tc>
-        <w:tc>
-          <w:tcPr>
-            <w:tcW w:type="dxa" w:w="2000"/>
-            <w:tcBorders>
-              <w:top w:val="single" w:color="BDD7EE" w:sz="1"/>
-              <w:left w:val="single" w:color="BDD7EE" w:sz="1"/>
-              <w:bottom w:val="single" w:color="BDD7EE" w:sz="1"/>
-              <w:right w:val="single" w:color="BDD7EE" w:sz="1"/>
-            </w:tcBorders>
-            <w:shd w:fill="FFFFFF" w:val="clear"/>
-            <w:tcMar>
-              <w:top w:type="dxa" w:w="80"/>
-              <w:left w:type="dxa" w:w="150"/>
-              <w:bottom w:type="dxa" w:w="80"/>
-              <w:right w:type="dxa" w:w="150"/>
-            </w:tcMar>
-            <w:vAlign w:val="center"/>
-          </w:tcPr>
-          <w:p>
-            <w:pPr>
-              <w:jc w:val="left"/>
-            </w:pPr>
-            <w:r>
-              <w:rPr>
-                <w:rFonts w:ascii="Arial" w:cs="Arial" w:eastAsia="Arial" w:hAnsi="Arial"/>
-                <w:b w:val="false"/>
-                <w:bCs w:val="false"/>
-                <w:color w:val="000000"/>
-                <w:sz w:val="18"/>
-                <w:szCs w:val="18"/>
-              </w:rPr>
-              <w:t xml:space="preserve">llamaindex_pipeline.py</w:t>
-            </w:r>
-          </w:p>
-        </w:tc>
-        <w:tc>
-          <w:tcPr>
-            <w:tcW w:type="dxa" w:w="2000"/>
-            <w:tcBorders>
-              <w:top w:val="single" w:color="BDD7EE" w:sz="1"/>
-              <w:left w:val="single" w:color="BDD7EE" w:sz="1"/>
-              <w:bottom w:val="single" w:color="BDD7EE" w:sz="1"/>
-              <w:right w:val="single" w:color="BDD7EE" w:sz="1"/>
-            </w:tcBorders>
-            <w:shd w:fill="FFFFFF" w:val="clear"/>
-            <w:tcMar>
-              <w:top w:type="dxa" w:w="80"/>
-              <w:left w:type="dxa" w:w="150"/>
-              <w:bottom w:type="dxa" w:w="80"/>
-              <w:right w:type="dxa" w:w="150"/>
-            </w:tcMar>
-            <w:vAlign w:val="center"/>
-          </w:tcPr>
-          <w:p>
-            <w:pPr>
-              <w:jc w:val="left"/>
-            </w:pPr>
-            <w:r>
-              <w:rPr>
-                <w:rFonts w:ascii="Arial" w:cs="Arial" w:eastAsia="Arial" w:hAnsi="Arial"/>
-                <w:b w:val="false"/>
-                <w:bCs w:val="false"/>
-                <w:color w:val="000000"/>
-                <w:sz w:val="18"/>
-                <w:szCs w:val="18"/>
-              </w:rPr>
-              <w:t xml:space="preserve">100%</w:t>
-            </w:r>
-          </w:p>
-        </w:tc>
-        <w:tc>
-          <w:tcPr>
-            <w:tcW w:type="dxa" w:w="2880"/>
-            <w:tcBorders>
-              <w:top w:val="single" w:color="BDD7EE" w:sz="1"/>
-              <w:left w:val="single" w:color="BDD7EE" w:sz="1"/>
-              <w:bottom w:val="single" w:color="BDD7EE" w:sz="1"/>
-              <w:right w:val="single" w:color="BDD7EE" w:sz="1"/>
-            </w:tcBorders>
-            <w:shd w:fill="FFFFFF" w:val="clear"/>
-            <w:tcMar>
-              <w:top w:type="dxa" w:w="80"/>
-              <w:left w:type="dxa" w:w="150"/>
-              <w:bottom w:type="dxa" w:w="80"/>
-              <w:right w:type="dxa" w:w="150"/>
-            </w:tcMar>
-            <w:vAlign w:val="center"/>
-          </w:tcPr>
-          <w:p>
-            <w:pPr>
-              <w:jc w:val="left"/>
-            </w:pPr>
-            <w:r>
-              <w:rPr>
-                <w:rFonts w:ascii="Arial" w:cs="Arial" w:eastAsia="Arial" w:hAnsi="Arial"/>
-                <w:b w:val="false"/>
-                <w:bCs w:val="false"/>
-                <w:color w:val="000000"/>
-                <w:sz w:val="18"/>
-                <w:szCs w:val="18"/>
-              </w:rPr>
-              <w:t xml:space="preserve">SentenceSplitter(512, overlap=50) fixed Q9 via chunk overlap.</w:t>
+              <w:t xml:space="preserve">We changed how documents are split into pieces. Instead of splitting at section headers, we split into overlapping pieces — each chunk shares 50 words with the next. Content at section boundaries is captured in both chunks.</w:t>
+            </w:r>
+          </w:p>
+        </w:tc>
+        <w:tc>
+          <w:tcPr>
+            <w:tcW w:type="dxa" w:w="2180"/>
+            <w:tcBorders>
+              <w:top w:val="single" w:color="BDD7EE" w:sz="1"/>
+              <w:left w:val="single" w:color="BDD7EE" w:sz="1"/>
+              <w:bottom w:val="single" w:color="BDD7EE" w:sz="1"/>
+              <w:right w:val="single" w:color="BDD7EE" w:sz="1"/>
+            </w:tcBorders>
+            <w:shd w:fill="FFFFFF" w:val="clear"/>
+            <w:tcMar>
+              <w:top w:type="dxa" w:w="80"/>
+              <w:left w:type="dxa" w:w="150"/>
+              <w:bottom w:type="dxa" w:w="80"/>
+              <w:right w:type="dxa" w:w="150"/>
+            </w:tcMar>
+            <w:vAlign w:val="center"/>
+          </w:tcPr>
+          <w:p>
+            <w:pPr>
+              <w:jc w:val="left"/>
+            </w:pPr>
+            <w:r>
+              <w:rPr>
+                <w:rFonts w:ascii="Arial" w:cs="Arial" w:eastAsia="Arial" w:hAnsi="Arial"/>
+                <w:b w:val="false"/>
+                <w:bCs w:val="false"/>
+                <w:color w:val="000000"/>
+                <w:sz w:val="18"/>
+                <w:szCs w:val="18"/>
+              </w:rPr>
+              <w:t xml:space="preserve">The overlap fixed Q9 — the answer lived at the boundary of two sections. Chunking strategy matters as much as model choice.</w:t>
             </w:r>
           </w:p>
         </w:tc>
@@ -20071,7 +20772,7 @@
       <w:tr>
         <w:tc>
           <w:tcPr>
-            <w:tcW w:type="dxa" w:w="1000"/>
+            <w:tcW w:type="dxa" w:w="600"/>
             <w:tcBorders>
               <w:top w:val="single" w:color="BDD7EE" w:sz="1"/>
               <w:left w:val="single" w:color="BDD7EE" w:sz="1"/>
@@ -20106,6 +20807,146 @@
         </w:tc>
         <w:tc>
           <w:tcPr>
+            <w:tcW w:type="dxa" w:w="1400"/>
+            <w:tcBorders>
+              <w:top w:val="single" w:color="BDD7EE" w:sz="1"/>
+              <w:left w:val="single" w:color="BDD7EE" w:sz="1"/>
+              <w:bottom w:val="single" w:color="BDD7EE" w:sz="1"/>
+              <w:right w:val="single" w:color="BDD7EE" w:sz="1"/>
+            </w:tcBorders>
+            <w:shd w:fill="EBF3FB" w:val="clear"/>
+            <w:tcMar>
+              <w:top w:type="dxa" w:w="80"/>
+              <w:left w:type="dxa" w:w="150"/>
+              <w:bottom w:type="dxa" w:w="80"/>
+              <w:right w:type="dxa" w:w="150"/>
+            </w:tcMar>
+            <w:vAlign w:val="center"/>
+          </w:tcPr>
+          <w:p>
+            <w:pPr>
+              <w:jc w:val="left"/>
+            </w:pPr>
+            <w:r>
+              <w:rPr>
+                <w:rFonts w:ascii="Arial" w:cs="Arial" w:eastAsia="Arial" w:hAnsi="Arial"/>
+                <w:b w:val="false"/>
+                <w:bCs w:val="false"/>
+                <w:color w:val="000000"/>
+                <w:sz w:val="18"/>
+                <w:szCs w:val="18"/>
+              </w:rPr>
+              <w:t xml:space="preserve">6e — Agentic RAG</w:t>
+            </w:r>
+          </w:p>
+        </w:tc>
+        <w:tc>
+          <w:tcPr>
+            <w:tcW w:type="dxa" w:w="1500"/>
+            <w:tcBorders>
+              <w:top w:val="single" w:color="BDD7EE" w:sz="1"/>
+              <w:left w:val="single" w:color="BDD7EE" w:sz="1"/>
+              <w:bottom w:val="single" w:color="BDD7EE" w:sz="1"/>
+              <w:right w:val="single" w:color="BDD7EE" w:sz="1"/>
+            </w:tcBorders>
+            <w:shd w:fill="EBF3FB" w:val="clear"/>
+            <w:tcMar>
+              <w:top w:type="dxa" w:w="80"/>
+              <w:left w:type="dxa" w:w="150"/>
+              <w:bottom w:type="dxa" w:w="80"/>
+              <w:right w:type="dxa" w:w="150"/>
+            </w:tcMar>
+            <w:vAlign w:val="center"/>
+          </w:tcPr>
+          <w:p>
+            <w:pPr>
+              <w:jc w:val="left"/>
+            </w:pPr>
+            <w:r>
+              <w:rPr>
+                <w:rFonts w:ascii="Arial" w:cs="Arial" w:eastAsia="Arial" w:hAnsi="Arial"/>
+                <w:b w:val="false"/>
+                <w:bCs w:val="false"/>
+                <w:color w:val="000000"/>
+                <w:sz w:val="18"/>
+                <w:szCs w:val="18"/>
+              </w:rPr>
+              <w:t xml:space="preserve">MCP Server</w:t>
+            </w:r>
+          </w:p>
+        </w:tc>
+        <w:tc>
+          <w:tcPr>
+            <w:tcW w:type="dxa" w:w="1400"/>
+            <w:tcBorders>
+              <w:top w:val="single" w:color="BDD7EE" w:sz="1"/>
+              <w:left w:val="single" w:color="BDD7EE" w:sz="1"/>
+              <w:bottom w:val="single" w:color="BDD7EE" w:sz="1"/>
+              <w:right w:val="single" w:color="BDD7EE" w:sz="1"/>
+            </w:tcBorders>
+            <w:shd w:fill="EBF3FB" w:val="clear"/>
+            <w:tcMar>
+              <w:top w:type="dxa" w:w="80"/>
+              <w:left w:type="dxa" w:w="150"/>
+              <w:bottom w:type="dxa" w:w="80"/>
+              <w:right w:type="dxa" w:w="150"/>
+            </w:tcMar>
+            <w:vAlign w:val="center"/>
+          </w:tcPr>
+          <w:p>
+            <w:pPr>
+              <w:jc w:val="left"/>
+            </w:pPr>
+            <w:r>
+              <w:rPr>
+                <w:rFonts w:ascii="Arial" w:cs="Arial" w:eastAsia="Arial" w:hAnsi="Arial"/>
+                <w:b w:val="false"/>
+                <w:bCs w:val="false"/>
+                <w:color w:val="000000"/>
+                <w:sz w:val="18"/>
+                <w:szCs w:val="18"/>
+              </w:rPr>
+              <w:t xml:space="preserve">mcp_server.py</w:t>
+            </w:r>
+          </w:p>
+        </w:tc>
+        <w:tc>
+          <w:tcPr>
+            <w:tcW w:type="dxa" w:w="800"/>
+            <w:tcBorders>
+              <w:top w:val="single" w:color="BDD7EE" w:sz="1"/>
+              <w:left w:val="single" w:color="BDD7EE" w:sz="1"/>
+              <w:bottom w:val="single" w:color="BDD7EE" w:sz="1"/>
+              <w:right w:val="single" w:color="BDD7EE" w:sz="1"/>
+            </w:tcBorders>
+            <w:shd w:fill="EBF3FB" w:val="clear"/>
+            <w:tcMar>
+              <w:top w:type="dxa" w:w="80"/>
+              <w:left w:type="dxa" w:w="150"/>
+              <w:bottom w:type="dxa" w:w="80"/>
+              <w:right w:type="dxa" w:w="150"/>
+            </w:tcMar>
+            <w:vAlign w:val="center"/>
+          </w:tcPr>
+          <w:p>
+            <w:pPr>
+              <w:jc w:val="left"/>
+            </w:pPr>
+            <w:r>
+              <w:rPr>
+                <w:rFonts w:ascii="Arial" w:cs="Arial" w:eastAsia="Arial" w:hAnsi="Arial"/>
+                <w:b w:val="false"/>
+                <w:bCs w:val="false"/>
+                <w:color w:val="000000"/>
+                <w:sz w:val="18"/>
+                <w:szCs w:val="18"/>
+              </w:rPr>
+              <w:t xml:space="preserve">—</w:t>
+            </w:r>
+          </w:p>
+        </w:tc>
+        <w:tc>
+          <w:tcPr>
             <w:tcW w:type="dxa" w:w="2200"/>
             <w:tcBorders>
               <w:top w:val="single" w:color="BDD7EE" w:sz="1"/>
@@ -20135,112 +20976,42 @@
                 <w:sz w:val="18"/>
                 <w:szCs w:val="18"/>
               </w:rPr>
-              <w:t xml:space="preserve">MCP Server</w:t>
-            </w:r>
-          </w:p>
-        </w:tc>
-        <w:tc>
-          <w:tcPr>
-            <w:tcW w:type="dxa" w:w="2000"/>
-            <w:tcBorders>
-              <w:top w:val="single" w:color="BDD7EE" w:sz="1"/>
-              <w:left w:val="single" w:color="BDD7EE" w:sz="1"/>
-              <w:bottom w:val="single" w:color="BDD7EE" w:sz="1"/>
-              <w:right w:val="single" w:color="BDD7EE" w:sz="1"/>
-            </w:tcBorders>
-            <w:shd w:fill="EBF3FB" w:val="clear"/>
-            <w:tcMar>
-              <w:top w:type="dxa" w:w="80"/>
-              <w:left w:type="dxa" w:w="150"/>
-              <w:bottom w:type="dxa" w:w="80"/>
-              <w:right w:type="dxa" w:w="150"/>
-            </w:tcMar>
-            <w:vAlign w:val="center"/>
-          </w:tcPr>
-          <w:p>
-            <w:pPr>
-              <w:jc w:val="left"/>
-            </w:pPr>
-            <w:r>
-              <w:rPr>
-                <w:rFonts w:ascii="Arial" w:cs="Arial" w:eastAsia="Arial" w:hAnsi="Arial"/>
-                <w:b w:val="false"/>
-                <w:bCs w:val="false"/>
-                <w:color w:val="000000"/>
-                <w:sz w:val="18"/>
-                <w:szCs w:val="18"/>
-              </w:rPr>
-              <w:t xml:space="preserve">mcp_server.py</w:t>
-            </w:r>
-          </w:p>
-        </w:tc>
-        <w:tc>
-          <w:tcPr>
-            <w:tcW w:type="dxa" w:w="2000"/>
-            <w:tcBorders>
-              <w:top w:val="single" w:color="BDD7EE" w:sz="1"/>
-              <w:left w:val="single" w:color="BDD7EE" w:sz="1"/>
-              <w:bottom w:val="single" w:color="BDD7EE" w:sz="1"/>
-              <w:right w:val="single" w:color="BDD7EE" w:sz="1"/>
-            </w:tcBorders>
-            <w:shd w:fill="EBF3FB" w:val="clear"/>
-            <w:tcMar>
-              <w:top w:type="dxa" w:w="80"/>
-              <w:left w:type="dxa" w:w="150"/>
-              <w:bottom w:type="dxa" w:w="80"/>
-              <w:right w:type="dxa" w:w="150"/>
-            </w:tcMar>
-            <w:vAlign w:val="center"/>
-          </w:tcPr>
-          <w:p>
-            <w:pPr>
-              <w:jc w:val="left"/>
-            </w:pPr>
-            <w:r>
-              <w:rPr>
-                <w:rFonts w:ascii="Arial" w:cs="Arial" w:eastAsia="Arial" w:hAnsi="Arial"/>
-                <w:b w:val="false"/>
-                <w:bCs w:val="false"/>
-                <w:color w:val="000000"/>
-                <w:sz w:val="18"/>
-                <w:szCs w:val="18"/>
-              </w:rPr>
-              <w:t xml:space="preserve">—</w:t>
-            </w:r>
-          </w:p>
-        </w:tc>
-        <w:tc>
-          <w:tcPr>
-            <w:tcW w:type="dxa" w:w="2880"/>
-            <w:tcBorders>
-              <w:top w:val="single" w:color="BDD7EE" w:sz="1"/>
-              <w:left w:val="single" w:color="BDD7EE" w:sz="1"/>
-              <w:bottom w:val="single" w:color="BDD7EE" w:sz="1"/>
-              <w:right w:val="single" w:color="BDD7EE" w:sz="1"/>
-            </w:tcBorders>
-            <w:shd w:fill="EBF3FB" w:val="clear"/>
-            <w:tcMar>
-              <w:top w:type="dxa" w:w="80"/>
-              <w:left w:type="dxa" w:w="150"/>
-              <w:bottom w:type="dxa" w:w="80"/>
-              <w:right w:type="dxa" w:w="150"/>
-            </w:tcMar>
-            <w:vAlign w:val="center"/>
-          </w:tcPr>
-          <w:p>
-            <w:pPr>
-              <w:jc w:val="left"/>
-            </w:pPr>
-            <w:r>
-              <w:rPr>
-                <w:rFonts w:ascii="Arial" w:cs="Arial" w:eastAsia="Arial" w:hAnsi="Arial"/>
-                <w:b w:val="false"/>
-                <w:bCs w:val="false"/>
-                <w:color w:val="000000"/>
-                <w:sz w:val="18"/>
-                <w:szCs w:val="18"/>
-              </w:rPr>
-              <w:t xml:space="preserve">RAG as MCP tool. Any Claude instance calls it. Build once, use everywhere.</w:t>
+              <w:t xml:space="preserve">We packaged the RAG pipeline as a standalone server following a standard protocol (MCP). Any Claude tool — Claude Code, Claude Desktop, any script — can call it by name without rewriting the pipeline code.</w:t>
+            </w:r>
+          </w:p>
+        </w:tc>
+        <w:tc>
+          <w:tcPr>
+            <w:tcW w:type="dxa" w:w="2180"/>
+            <w:tcBorders>
+              <w:top w:val="single" w:color="BDD7EE" w:sz="1"/>
+              <w:left w:val="single" w:color="BDD7EE" w:sz="1"/>
+              <w:bottom w:val="single" w:color="BDD7EE" w:sz="1"/>
+              <w:right w:val="single" w:color="BDD7EE" w:sz="1"/>
+            </w:tcBorders>
+            <w:shd w:fill="EBF3FB" w:val="clear"/>
+            <w:tcMar>
+              <w:top w:type="dxa" w:w="80"/>
+              <w:left w:type="dxa" w:w="150"/>
+              <w:bottom w:type="dxa" w:w="80"/>
+              <w:right w:type="dxa" w:w="150"/>
+            </w:tcMar>
+            <w:vAlign w:val="center"/>
+          </w:tcPr>
+          <w:p>
+            <w:pPr>
+              <w:jc w:val="left"/>
+            </w:pPr>
+            <w:r>
+              <w:rPr>
+                <w:rFonts w:ascii="Arial" w:cs="Arial" w:eastAsia="Arial" w:hAnsi="Arial"/>
+                <w:b w:val="false"/>
+                <w:bCs w:val="false"/>
+                <w:color w:val="000000"/>
+                <w:sz w:val="18"/>
+                <w:szCs w:val="18"/>
+              </w:rPr>
+              <w:t xml:space="preserve">Build once, use everywhere. The production version of Step 6e — same idea (Claude calls a search tool), now a shared service not a one-off script.</w:t>
             </w:r>
           </w:p>
         </w:tc>

</xml_diff>